<commit_message>
Updates to 2026 ethics application, as submitted
</commit_message>
<xml_diff>
--- a/StateOfPractice/MACREM-2026/SupportingDocuments/InterviewGuide.docx
+++ b/StateOfPractice/MACREM-2026/SupportingDocuments/InterviewGuide.docx
@@ -131,6 +131,33 @@
       </w:pPr>
     </w:p>
     <w:p>
+      <w:pPr>
+        <w:rPr>
+          <w:b/>
+          <w:bCs/>
+          <w:sz w:val="22"/>
+          <w:szCs w:val="22"/>
+        </w:rPr>
+      </w:pPr>
+      <w:r>
+        <w:rPr>
+          <w:b/>
+          <w:bCs/>
+          <w:sz w:val="22"/>
+          <w:szCs w:val="22"/>
+        </w:rPr>
+        <w:t>Questions about Interviewee</w:t>
+      </w:r>
+    </w:p>
+    <w:p>
+      <w:pPr>
+        <w:rPr>
+          <w:sz w:val="22"/>
+          <w:szCs w:val="22"/>
+        </w:rPr>
+      </w:pPr>
+    </w:p>
+    <w:p>
       <w:r>
         <w:rPr>
           <w:b/>
@@ -167,6 +194,13 @@
       </w:r>
     </w:p>
     <w:p>
+      <w:pPr>
+        <w:rPr>
+          <w:b/>
+          <w:sz w:val="22"/>
+          <w:szCs w:val="22"/>
+        </w:rPr>
+      </w:pPr>
       <w:r>
         <w:rPr>
           <w:b/>
@@ -177,6 +211,33 @@
       </w:r>
     </w:p>
     <w:p>
+      <w:pPr>
+        <w:rPr>
+          <w:b/>
+          <w:sz w:val="22"/>
+          <w:szCs w:val="22"/>
+        </w:rPr>
+      </w:pPr>
+    </w:p>
+    <w:p>
+      <w:pPr>
+        <w:rPr>
+          <w:b/>
+          <w:sz w:val="22"/>
+          <w:szCs w:val="22"/>
+        </w:rPr>
+      </w:pPr>
+      <w:r>
+        <w:rPr>
+          <w:b/>
+          <w:sz w:val="22"/>
+          <w:szCs w:val="22"/>
+        </w:rPr>
+        <w:t>Questions about Developers and Development Process, Tools and Techniques</w:t>
+      </w:r>
+    </w:p>
+    <w:p/>
+    <w:p>
       <w:r>
         <w:rPr>
           <w:b/>
@@ -193,67 +254,75 @@
           <w:sz w:val="22"/>
           <w:szCs w:val="22"/>
         </w:rPr>
-        <w:t>5. Do you have a defined process for accepting new contributions into your team?</w:t>
-      </w:r>
-    </w:p>
-    <w:p>
-      <w:r>
-        <w:rPr>
-          <w:b/>
-          <w:sz w:val="22"/>
-          <w:szCs w:val="22"/>
-        </w:rPr>
-        <w:t>6. What is the typical background of a developer?</w:t>
-      </w:r>
-    </w:p>
-    <w:p>
-      <w:r>
-        <w:rPr>
-          <w:b/>
-          <w:sz w:val="22"/>
-          <w:szCs w:val="22"/>
-        </w:rPr>
-        <w:t>7. What is your estimated number of users? How did you come up with that estimate?</w:t>
-      </w:r>
-    </w:p>
-    <w:p>
-      <w:r>
-        <w:rPr>
-          <w:b/>
-          <w:sz w:val="22"/>
-          <w:szCs w:val="22"/>
-        </w:rPr>
-        <w:t>8. What is the typical background of a user?</w:t>
-      </w:r>
-    </w:p>
-    <w:p>
-      <w:r>
-        <w:rPr>
-          <w:b/>
-          <w:sz w:val="22"/>
-          <w:szCs w:val="22"/>
-        </w:rPr>
-        <w:t>9. Currently, what are the most significant obstacles in your development process?</w:t>
-      </w:r>
-    </w:p>
-    <w:p>
-      <w:r>
-        <w:rPr>
-          <w:b/>
-          <w:sz w:val="22"/>
-          <w:szCs w:val="22"/>
-        </w:rPr>
-        <w:t>10. How might you change your development process to remove or reduce these obstacles?</w:t>
-      </w:r>
-    </w:p>
-    <w:p>
-      <w:r>
-        <w:rPr>
-          <w:b/>
-          <w:sz w:val="22"/>
-          <w:szCs w:val="22"/>
-        </w:rPr>
-        <w:t xml:space="preserve">11. How does documentation fit into your development process? Would </w:t>
+        <w:t>5</w:t>
+      </w:r>
+      <w:r>
+        <w:rPr>
+          <w:b/>
+          <w:sz w:val="22"/>
+          <w:szCs w:val="22"/>
+        </w:rPr>
+        <w:t>. What is the typical background of a developer?</w:t>
+      </w:r>
+    </w:p>
+    <w:p>
+      <w:r>
+        <w:rPr>
+          <w:b/>
+          <w:sz w:val="22"/>
+          <w:szCs w:val="22"/>
+        </w:rPr>
+        <w:t>6</w:t>
+      </w:r>
+      <w:r>
+        <w:rPr>
+          <w:b/>
+          <w:sz w:val="22"/>
+          <w:szCs w:val="22"/>
+        </w:rPr>
+        <w:t xml:space="preserve">. Currently, what are the most significant </w:t>
+      </w:r>
+      <w:r>
+        <w:rPr>
+          <w:b/>
+          <w:sz w:val="22"/>
+          <w:szCs w:val="22"/>
+        </w:rPr>
+        <w:t xml:space="preserve">pain points </w:t>
+      </w:r>
+      <w:r>
+        <w:rPr>
+          <w:b/>
+          <w:sz w:val="22"/>
+          <w:szCs w:val="22"/>
+        </w:rPr>
+        <w:t>in your development process?</w:t>
+      </w:r>
+      <w:r>
+        <w:rPr>
+          <w:b/>
+          <w:sz w:val="22"/>
+          <w:szCs w:val="22"/>
+        </w:rPr>
+        <w:t xml:space="preserve">  Specifically, what are the pain points in the following parts of the development process: a) requirements definition (defining what the software should do), b) design, c) implementation, and d) verification.</w:t>
+      </w:r>
+    </w:p>
+    <w:p>
+      <w:r>
+        <w:rPr>
+          <w:b/>
+          <w:sz w:val="22"/>
+          <w:szCs w:val="22"/>
+        </w:rPr>
+        <w:t>7</w:t>
+      </w:r>
+      <w:r>
+        <w:rPr>
+          <w:b/>
+          <w:sz w:val="22"/>
+          <w:szCs w:val="22"/>
+        </w:rPr>
+        <w:t xml:space="preserve">. How does documentation fit into your development process? Would </w:t>
       </w:r>
       <w:proofErr w:type="spellStart"/>
       <w:r>
@@ -281,47 +350,124 @@
           <w:sz w:val="22"/>
           <w:szCs w:val="22"/>
         </w:rPr>
-        <w:t>12. In the past, is there any major obstacle to your development process that has been solved? How did you solve it?</w:t>
-      </w:r>
-    </w:p>
-    <w:p>
-      <w:r>
-        <w:rPr>
-          <w:b/>
-          <w:sz w:val="22"/>
-          <w:szCs w:val="22"/>
-        </w:rPr>
-        <w:t>13. What is your software development model? For example, waterfall, agile, etc.</w:t>
-      </w:r>
-    </w:p>
-    <w:p>
-      <w:r>
-        <w:rPr>
-          <w:b/>
-          <w:sz w:val="22"/>
-          <w:szCs w:val="22"/>
-        </w:rPr>
-        <w:t>14. What is your project management process? Do you think improving this process can</w:t>
-      </w:r>
-    </w:p>
-    <w:p>
-      <w:r>
-        <w:rPr>
-          <w:b/>
-          <w:sz w:val="22"/>
-          <w:szCs w:val="22"/>
-        </w:rPr>
-        <w:t>tackle the current problem? Were any project management tools used?</w:t>
-      </w:r>
-    </w:p>
-    <w:p>
-      <w:r>
-        <w:rPr>
-          <w:b/>
-          <w:sz w:val="22"/>
-          <w:szCs w:val="22"/>
-        </w:rPr>
-        <w:t xml:space="preserve">15. Was it hard to ensure the correctness of the software? If there were any obstacles, what methods have been considered or practiced </w:t>
+        <w:t>8</w:t>
+      </w:r>
+      <w:r>
+        <w:rPr>
+          <w:b/>
+          <w:sz w:val="22"/>
+          <w:szCs w:val="22"/>
+        </w:rPr>
+        <w:t>. In the past, is there any major obstacle to your development process that has been solved? How did you solve it?</w:t>
+      </w:r>
+    </w:p>
+    <w:p>
+      <w:r>
+        <w:rPr>
+          <w:b/>
+          <w:sz w:val="22"/>
+          <w:szCs w:val="22"/>
+        </w:rPr>
+        <w:t>9</w:t>
+      </w:r>
+      <w:r>
+        <w:rPr>
+          <w:b/>
+          <w:sz w:val="22"/>
+          <w:szCs w:val="22"/>
+        </w:rPr>
+        <w:t>. What is your software development model? For example, waterfall, agile, etc.</w:t>
+      </w:r>
+    </w:p>
+    <w:p>
+      <w:pPr>
+        <w:rPr>
+          <w:b/>
+          <w:sz w:val="22"/>
+          <w:szCs w:val="22"/>
+        </w:rPr>
+      </w:pPr>
+      <w:r>
+        <w:rPr>
+          <w:b/>
+          <w:sz w:val="22"/>
+          <w:szCs w:val="22"/>
+        </w:rPr>
+        <w:t>1</w:t>
+      </w:r>
+      <w:r>
+        <w:rPr>
+          <w:b/>
+          <w:sz w:val="22"/>
+          <w:szCs w:val="22"/>
+        </w:rPr>
+        <w:t>0</w:t>
+      </w:r>
+      <w:r>
+        <w:rPr>
+          <w:b/>
+          <w:sz w:val="22"/>
+          <w:szCs w:val="22"/>
+        </w:rPr>
+        <w:t xml:space="preserve">. What is your project management process? </w:t>
+      </w:r>
+      <w:r>
+        <w:rPr>
+          <w:b/>
+          <w:sz w:val="22"/>
+          <w:szCs w:val="22"/>
+        </w:rPr>
+        <w:t xml:space="preserve">Are </w:t>
+      </w:r>
+      <w:r>
+        <w:rPr>
+          <w:b/>
+          <w:sz w:val="22"/>
+          <w:szCs w:val="22"/>
+        </w:rPr>
+        <w:t>any project management tools used?</w:t>
+      </w:r>
+    </w:p>
+    <w:p>
+      <w:r>
+        <w:rPr>
+          <w:b/>
+          <w:sz w:val="22"/>
+          <w:szCs w:val="22"/>
+        </w:rPr>
+        <w:t>1</w:t>
+      </w:r>
+      <w:r>
+        <w:rPr>
+          <w:b/>
+          <w:sz w:val="22"/>
+          <w:szCs w:val="22"/>
+        </w:rPr>
+        <w:t>1</w:t>
+      </w:r>
+      <w:r>
+        <w:rPr>
+          <w:b/>
+          <w:sz w:val="22"/>
+          <w:szCs w:val="22"/>
+        </w:rPr>
+        <w:t xml:space="preserve">. </w:t>
+      </w:r>
+      <w:r>
+        <w:rPr>
+          <w:b/>
+          <w:sz w:val="22"/>
+          <w:szCs w:val="22"/>
+        </w:rPr>
+        <w:t xml:space="preserve">Is </w:t>
+      </w:r>
+      <w:r>
+        <w:rPr>
+          <w:b/>
+          <w:sz w:val="22"/>
+          <w:szCs w:val="22"/>
+        </w:rPr>
+        <w:t xml:space="preserve">it hard to ensure the correctness of the software? If there were any obstacles, what methods have been considered or practiced </w:t>
       </w:r>
       <w:proofErr w:type="gramStart"/>
       <w:r>
@@ -349,47 +495,236 @@
           <w:sz w:val="22"/>
           <w:szCs w:val="22"/>
         </w:rPr>
-        <w:t>16. When designing the software, did you consider the ease of future changes? For example, will it be hard to change the structure of the system, modules or code blocks? What measures have been taken to ensure the ease of future changes and maintains?</w:t>
-      </w:r>
-    </w:p>
-    <w:p>
-      <w:r>
-        <w:rPr>
-          <w:b/>
-          <w:sz w:val="22"/>
-          <w:szCs w:val="22"/>
-        </w:rPr>
-        <w:t>17. Provide instances where users have misunderstood the software. What, if any, actions were taken to address understandability issues?</w:t>
-      </w:r>
-    </w:p>
-    <w:p>
-      <w:r>
-        <w:rPr>
-          <w:b/>
-          <w:sz w:val="22"/>
-          <w:szCs w:val="22"/>
-        </w:rPr>
-        <w:t>18. What, if any, actions were taken to address usability issues?</w:t>
-      </w:r>
-    </w:p>
-    <w:p>
-      <w:r>
-        <w:rPr>
-          <w:b/>
-          <w:sz w:val="22"/>
-          <w:szCs w:val="22"/>
-        </w:rPr>
-        <w:t>19. Do you think the current documentation can clearly convey all necessary knowledge to the users? If yes, how did you successfully achieve it? If no, what improvements are needed?</w:t>
-      </w:r>
-    </w:p>
-    <w:p>
-      <w:r>
-        <w:rPr>
-          <w:b/>
-          <w:sz w:val="22"/>
-          <w:szCs w:val="22"/>
-        </w:rPr>
-        <w:t xml:space="preserve">20. Do you have any concern that your computational results won’t be reproducible in the future? Have you taken any steps to ensure reproducibility? </w:t>
+        <w:t>1</w:t>
+      </w:r>
+      <w:r>
+        <w:rPr>
+          <w:b/>
+          <w:sz w:val="22"/>
+          <w:szCs w:val="22"/>
+        </w:rPr>
+        <w:t>2</w:t>
+      </w:r>
+      <w:r>
+        <w:rPr>
+          <w:b/>
+          <w:sz w:val="22"/>
+          <w:szCs w:val="22"/>
+        </w:rPr>
+        <w:t xml:space="preserve">. When designing the software, did you consider the ease of future changes? For example, will it be hard to change the structure of the system, modules or code blocks? What measures have been taken to ensure the ease of future changes and </w:t>
+      </w:r>
+      <w:r>
+        <w:rPr>
+          <w:b/>
+          <w:sz w:val="22"/>
+          <w:szCs w:val="22"/>
+        </w:rPr>
+        <w:t>maintenance</w:t>
+      </w:r>
+      <w:r>
+        <w:rPr>
+          <w:b/>
+          <w:sz w:val="22"/>
+          <w:szCs w:val="22"/>
+        </w:rPr>
+        <w:t>?</w:t>
+      </w:r>
+    </w:p>
+    <w:p>
+      <w:pPr>
+        <w:rPr>
+          <w:b/>
+          <w:sz w:val="22"/>
+          <w:szCs w:val="22"/>
+        </w:rPr>
+      </w:pPr>
+      <w:r>
+        <w:rPr>
+          <w:b/>
+          <w:sz w:val="22"/>
+          <w:szCs w:val="22"/>
+        </w:rPr>
+        <w:t>13</w:t>
+      </w:r>
+      <w:r>
+        <w:rPr>
+          <w:b/>
+          <w:sz w:val="22"/>
+          <w:szCs w:val="22"/>
+        </w:rPr>
+        <w:t xml:space="preserve">. Do you have any concern that your computational results won’t be reproducible in the future? Have you taken any steps to ensure reproducibility? </w:t>
+      </w:r>
+    </w:p>
+    <w:p>
+      <w:pPr>
+        <w:rPr>
+          <w:b/>
+          <w:sz w:val="22"/>
+          <w:szCs w:val="22"/>
+        </w:rPr>
+      </w:pPr>
+      <w:r>
+        <w:rPr>
+          <w:b/>
+          <w:sz w:val="22"/>
+          <w:szCs w:val="22"/>
+        </w:rPr>
+        <w:t>14. What positive contributions do LLM-based tools have on your development process with respect to documentation, coding and testing?</w:t>
+      </w:r>
+    </w:p>
+    <w:p>
+      <w:r>
+        <w:rPr>
+          <w:b/>
+          <w:sz w:val="22"/>
+          <w:szCs w:val="22"/>
+        </w:rPr>
+        <w:t>15. What negatives are associated with LLM-based tools?</w:t>
+      </w:r>
+    </w:p>
+    <w:p>
+      <w:pPr>
+        <w:rPr>
+          <w:b/>
+          <w:sz w:val="22"/>
+          <w:szCs w:val="22"/>
+        </w:rPr>
+      </w:pPr>
+    </w:p>
+    <w:p>
+      <w:pPr>
+        <w:rPr>
+          <w:b/>
+          <w:sz w:val="22"/>
+          <w:szCs w:val="22"/>
+        </w:rPr>
+      </w:pPr>
+      <w:r>
+        <w:rPr>
+          <w:b/>
+          <w:sz w:val="22"/>
+          <w:szCs w:val="22"/>
+        </w:rPr>
+        <w:t>Questions about Users</w:t>
+      </w:r>
+    </w:p>
+    <w:p>
+      <w:pPr>
+        <w:rPr>
+          <w:b/>
+          <w:sz w:val="22"/>
+          <w:szCs w:val="22"/>
+        </w:rPr>
+      </w:pPr>
+    </w:p>
+    <w:p>
+      <w:r>
+        <w:rPr>
+          <w:b/>
+          <w:sz w:val="22"/>
+          <w:szCs w:val="22"/>
+        </w:rPr>
+        <w:t>1</w:t>
+      </w:r>
+      <w:r>
+        <w:rPr>
+          <w:b/>
+          <w:sz w:val="22"/>
+          <w:szCs w:val="22"/>
+        </w:rPr>
+        <w:t>6</w:t>
+      </w:r>
+      <w:r>
+        <w:rPr>
+          <w:b/>
+          <w:sz w:val="22"/>
+          <w:szCs w:val="22"/>
+        </w:rPr>
+        <w:t>. What is the typical background of a user?</w:t>
+      </w:r>
+    </w:p>
+    <w:p>
+      <w:r>
+        <w:rPr>
+          <w:b/>
+          <w:sz w:val="22"/>
+          <w:szCs w:val="22"/>
+        </w:rPr>
+        <w:t>1</w:t>
+      </w:r>
+      <w:r>
+        <w:rPr>
+          <w:b/>
+          <w:sz w:val="22"/>
+          <w:szCs w:val="22"/>
+        </w:rPr>
+        <w:t>7</w:t>
+      </w:r>
+      <w:r>
+        <w:rPr>
+          <w:b/>
+          <w:sz w:val="22"/>
+          <w:szCs w:val="22"/>
+        </w:rPr>
+        <w:t xml:space="preserve">. Provide instances where users have misunderstood </w:t>
+      </w:r>
+      <w:r>
+        <w:rPr>
+          <w:b/>
+          <w:sz w:val="22"/>
+          <w:szCs w:val="22"/>
+        </w:rPr>
+        <w:t xml:space="preserve">or misused </w:t>
+      </w:r>
+      <w:r>
+        <w:rPr>
+          <w:b/>
+          <w:sz w:val="22"/>
+          <w:szCs w:val="22"/>
+        </w:rPr>
+        <w:t xml:space="preserve">the software. What, if any, actions were taken to address </w:t>
+      </w:r>
+      <w:r>
+        <w:rPr>
+          <w:b/>
+          <w:sz w:val="22"/>
+          <w:szCs w:val="22"/>
+        </w:rPr>
+        <w:t>usability</w:t>
+      </w:r>
+      <w:r>
+        <w:rPr>
+          <w:b/>
+          <w:sz w:val="22"/>
+          <w:szCs w:val="22"/>
+        </w:rPr>
+        <w:t xml:space="preserve"> issues?</w:t>
+      </w:r>
+    </w:p>
+    <w:p>
+      <w:r>
+        <w:rPr>
+          <w:b/>
+          <w:sz w:val="22"/>
+          <w:szCs w:val="22"/>
+        </w:rPr>
+        <w:t>1</w:t>
+      </w:r>
+      <w:r>
+        <w:rPr>
+          <w:b/>
+          <w:sz w:val="22"/>
+          <w:szCs w:val="22"/>
+        </w:rPr>
+        <w:t>8</w:t>
+      </w:r>
+      <w:r>
+        <w:rPr>
+          <w:b/>
+          <w:sz w:val="22"/>
+          <w:szCs w:val="22"/>
+        </w:rPr>
+        <w:t>. Do you think the current documentation can clearly convey all necessary knowledge to the users? If yes, how did you successfully achieve it? If no, what improvements are needed?</w:t>
       </w:r>
     </w:p>
     <w:p>

</xml_diff>

<commit_message>
Revise interview guide and remove outdated PDF： - refine the LLM question wording - add a question about understanding users' needs - remove the outdated PDF version
</commit_message>
<xml_diff>
--- a/StateOfPractice/MACREM-2026/SupportingDocuments/InterviewGuide.docx
+++ b/StateOfPractice/MACREM-2026/SupportingDocuments/InterviewGuide.docx
@@ -1,10 +1,10 @@
 
 <file path=word/document.xml><?xml version="1.0" encoding="utf-8"?>
-<w:document xmlns:wpc="http://schemas.microsoft.com/office/word/2010/wordprocessingCanvas" xmlns:cx="http://schemas.microsoft.com/office/drawing/2014/chartex" xmlns:cx1="http://schemas.microsoft.com/office/drawing/2015/9/8/chartex" xmlns:cx2="http://schemas.microsoft.com/office/drawing/2015/10/21/chartex" xmlns:cx3="http://schemas.microsoft.com/office/drawing/2016/5/9/chartex" xmlns:cx4="http://schemas.microsoft.com/office/drawing/2016/5/10/chartex" xmlns:cx5="http://schemas.microsoft.com/office/drawing/2016/5/11/chartex" xmlns:cx6="http://schemas.microsoft.com/office/drawing/2016/5/12/chartex" xmlns:cx7="http://schemas.microsoft.com/office/drawing/2016/5/13/chartex" xmlns:cx8="http://schemas.microsoft.com/office/drawing/2016/5/14/chartex" xmlns:mc="http://schemas.openxmlformats.org/markup-compatibility/2006" xmlns:m="http://schemas.openxmlformats.org/officeDocument/2006/math" xmlns:aink="http://schemas.microsoft.com/office/drawing/2016/ink" xmlns:am3d="http://schemas.microsoft.com/office/drawing/2017/model3d" xmlns:oel="http://schemas.microsoft.com/office/2019/extlst" xmlns:r="http://schemas.openxmlformats.org/officeDocument/2006/relationships" xmlns:wp14="http://schemas.microsoft.com/office/word/2010/wordprocessingDrawing" xmlns:wp="http://schemas.openxmlformats.org/drawingml/2006/wordprocessingDrawing" xmlns:wpg="http://schemas.microsoft.com/office/word/2010/wordprocessingGroup" xmlns:wpi="http://schemas.microsoft.com/office/word/2010/wordprocessingInk" xmlns:wps="http://schemas.microsoft.com/office/word/2010/wordprocessingShape" xmlns:o="urn:schemas-microsoft-com:office:office" xmlns:v="urn:schemas-microsoft-com:vml" xmlns:w10="urn:schemas-microsoft-com:office:word" xmlns:w="http://schemas.openxmlformats.org/wordprocessingml/2006/main" xmlns:w14="http://schemas.microsoft.com/office/word/2010/wordml" xmlns:w15="http://schemas.microsoft.com/office/word/2012/wordml" xmlns:w16cex="http://schemas.microsoft.com/office/word/2018/wordml/cex" xmlns:w16cid="http://schemas.microsoft.com/office/word/2016/wordml/cid" xmlns:w16="http://schemas.microsoft.com/office/word/2018/wordml" xmlns:w16sdtdh="http://schemas.microsoft.com/office/word/2020/wordml/sdtdatahash" xmlns:w16sdtfl="http://schemas.microsoft.com/office/word/2024/wordml/sdtformatlock" xmlns:w16se="http://schemas.microsoft.com/office/word/2015/wordml/symex" xmlns:w16du="http://schemas.microsoft.com/office/word/2023/wordml/word16du" xmlns:wne="http://schemas.microsoft.com/office/word/2006/wordml" mc:Ignorable="w14 w15 w16se w16cid w16 w16cex w16sdtdh w16sdtfl w16du wp14">
+<w:document xmlns:wpc="http://schemas.microsoft.com/office/word/2010/wordprocessingCanvas" xmlns:cx="http://schemas.microsoft.com/office/drawing/2014/chartex" xmlns:cx1="http://schemas.microsoft.com/office/drawing/2015/9/8/chartex" xmlns:cx2="http://schemas.microsoft.com/office/drawing/2015/10/21/chartex" xmlns:cx3="http://schemas.microsoft.com/office/drawing/2016/5/9/chartex" xmlns:cx4="http://schemas.microsoft.com/office/drawing/2016/5/10/chartex" xmlns:cx5="http://schemas.microsoft.com/office/drawing/2016/5/11/chartex" xmlns:cx6="http://schemas.microsoft.com/office/drawing/2016/5/12/chartex" xmlns:cx7="http://schemas.microsoft.com/office/drawing/2016/5/13/chartex" xmlns:cx8="http://schemas.microsoft.com/office/drawing/2016/5/14/chartex" xmlns:mc="http://schemas.openxmlformats.org/markup-compatibility/2006" xmlns:aink="http://schemas.microsoft.com/office/drawing/2016/ink" xmlns:am3d="http://schemas.microsoft.com/office/drawing/2017/model3d" xmlns:o="urn:schemas-microsoft-com:office:office" xmlns:oel="http://schemas.microsoft.com/office/2019/extlst" xmlns:r="http://schemas.openxmlformats.org/officeDocument/2006/relationships" xmlns:m="http://schemas.openxmlformats.org/officeDocument/2006/math" xmlns:v="urn:schemas-microsoft-com:vml" xmlns:wp14="http://schemas.microsoft.com/office/word/2010/wordprocessingDrawing" xmlns:wp="http://schemas.openxmlformats.org/drawingml/2006/wordprocessingDrawing" xmlns:w10="urn:schemas-microsoft-com:office:word" xmlns:w="http://schemas.openxmlformats.org/wordprocessingml/2006/main" xmlns:w14="http://schemas.microsoft.com/office/word/2010/wordml" xmlns:w15="http://schemas.microsoft.com/office/word/2012/wordml" xmlns:w16cex="http://schemas.microsoft.com/office/word/2018/wordml/cex" xmlns:w16cid="http://schemas.microsoft.com/office/word/2016/wordml/cid" xmlns:w16="http://schemas.microsoft.com/office/word/2018/wordml" xmlns:w16du="http://schemas.microsoft.com/office/word/2023/wordml/word16du" xmlns:w16sdtdh="http://schemas.microsoft.com/office/word/2020/wordml/sdtdatahash" xmlns:w16sdtfl="http://schemas.microsoft.com/office/word/2024/wordml/sdtformatlock" xmlns:w16se="http://schemas.microsoft.com/office/word/2015/wordml/symex" xmlns:wpg="http://schemas.microsoft.com/office/word/2010/wordprocessingGroup" xmlns:wpi="http://schemas.microsoft.com/office/word/2010/wordprocessingInk" xmlns:wne="http://schemas.microsoft.com/office/word/2006/wordml" xmlns:wps="http://schemas.microsoft.com/office/word/2010/wordprocessingShape" mc:Ignorable="w14 w15 w16se w16cid w16 w16cex w16sdtdh w16sdtfl w16du wp14">
   <w:body>
     <w:p>
       <w:pPr>
-        <w:pStyle w:val="Heading1"/>
+        <w:pStyle w:val="1"/>
         <w:spacing w:line="240" w:lineRule="auto"/>
         <w:jc w:val="center"/>
         <w:rPr>
@@ -264,6 +264,435 @@
           <w:sz w:val="22"/>
           <w:szCs w:val="22"/>
         </w:rPr>
+        <w:t>6. What is your software development model? For example, waterfall, agile, etc.</w:t>
+      </w:r>
+    </w:p>
+    <w:p>
+      <w:pPr>
+        <w:rPr>
+          <w:b/>
+          <w:sz w:val="22"/>
+          <w:szCs w:val="22"/>
+        </w:rPr>
+      </w:pPr>
+      <w:r>
+        <w:rPr>
+          <w:b/>
+          <w:sz w:val="22"/>
+          <w:szCs w:val="22"/>
+        </w:rPr>
+        <w:t xml:space="preserve">7. What is your project management process?  How is git used? Are there other project management tools? </w:t>
+      </w:r>
+    </w:p>
+    <w:p>
+      <w:r>
+        <w:rPr>
+          <w:b/>
+          <w:sz w:val="22"/>
+          <w:szCs w:val="22"/>
+        </w:rPr>
+        <w:t>8</w:t>
+      </w:r>
+      <w:r>
+        <w:rPr>
+          <w:b/>
+          <w:sz w:val="22"/>
+          <w:szCs w:val="22"/>
+        </w:rPr>
+        <w:t xml:space="preserve">. Currently, what are the most significant </w:t>
+      </w:r>
+      <w:r>
+        <w:rPr>
+          <w:b/>
+          <w:sz w:val="22"/>
+          <w:szCs w:val="22"/>
+        </w:rPr>
+        <w:t xml:space="preserve">pain points </w:t>
+      </w:r>
+      <w:r>
+        <w:rPr>
+          <w:b/>
+          <w:sz w:val="22"/>
+          <w:szCs w:val="22"/>
+        </w:rPr>
+        <w:t xml:space="preserve">in your development process?  Specifically, what are the pain points in the following </w:t>
+      </w:r>
+      <w:r>
+        <w:rPr>
+          <w:b/>
+          <w:sz w:val="22"/>
+          <w:szCs w:val="22"/>
+        </w:rPr>
+        <w:t>stages</w:t>
+      </w:r>
+      <w:r>
+        <w:rPr>
+          <w:b/>
+          <w:sz w:val="22"/>
+          <w:szCs w:val="22"/>
+        </w:rPr>
+        <w:t xml:space="preserve"> of the development process: a) requirements definition (defining what the software should do), b) design, c) implementation, and d) verification.</w:t>
+      </w:r>
+    </w:p>
+    <w:p>
+      <w:r>
+        <w:rPr>
+          <w:b/>
+          <w:sz w:val="22"/>
+          <w:szCs w:val="22"/>
+        </w:rPr>
+        <w:t>9</w:t>
+      </w:r>
+      <w:r>
+        <w:rPr>
+          <w:b/>
+          <w:sz w:val="22"/>
+          <w:szCs w:val="22"/>
+        </w:rPr>
+        <w:t xml:space="preserve">. How does documentation fit into your development process? Would </w:t>
+      </w:r>
+      <w:proofErr w:type="spellStart"/>
+      <w:r>
+        <w:rPr>
+          <w:b/>
+          <w:sz w:val="22"/>
+          <w:szCs w:val="22"/>
+        </w:rPr>
+        <w:t>improved</w:t>
+      </w:r>
+      <w:proofErr w:type="spellEnd"/>
+      <w:r>
+        <w:rPr>
+          <w:b/>
+          <w:sz w:val="22"/>
+          <w:szCs w:val="22"/>
+        </w:rPr>
+        <w:t xml:space="preserve"> documentation help with the obstacles you typically face?</w:t>
+      </w:r>
+    </w:p>
+    <w:p>
+      <w:r>
+        <w:rPr>
+          <w:b/>
+          <w:sz w:val="22"/>
+          <w:szCs w:val="22"/>
+        </w:rPr>
+        <w:t>10</w:t>
+      </w:r>
+      <w:r>
+        <w:rPr>
+          <w:b/>
+          <w:sz w:val="22"/>
+          <w:szCs w:val="22"/>
+        </w:rPr>
+        <w:t>. In the past, is there any major obstacle to your development process that has been solved? How did you solve it?</w:t>
+      </w:r>
+    </w:p>
+    <w:p>
+      <w:r>
+        <w:rPr>
+          <w:b/>
+          <w:sz w:val="22"/>
+          <w:szCs w:val="22"/>
+        </w:rPr>
+        <w:t>1</w:t>
+      </w:r>
+      <w:r>
+        <w:rPr>
+          <w:b/>
+          <w:sz w:val="22"/>
+          <w:szCs w:val="22"/>
+        </w:rPr>
+        <w:t>1</w:t>
+      </w:r>
+      <w:r>
+        <w:rPr>
+          <w:b/>
+          <w:sz w:val="22"/>
+          <w:szCs w:val="22"/>
+        </w:rPr>
+        <w:t xml:space="preserve">. </w:t>
+      </w:r>
+      <w:r>
+        <w:rPr>
+          <w:b/>
+          <w:sz w:val="22"/>
+          <w:szCs w:val="22"/>
+        </w:rPr>
+        <w:t xml:space="preserve">Is </w:t>
+      </w:r>
+      <w:r>
+        <w:rPr>
+          <w:b/>
+          <w:sz w:val="22"/>
+          <w:szCs w:val="22"/>
+        </w:rPr>
+        <w:t xml:space="preserve">it hard to ensure the correctness of the software? If there </w:t>
+      </w:r>
+      <w:proofErr w:type="gramStart"/>
+      <w:r>
+        <w:rPr>
+          <w:b/>
+          <w:sz w:val="22"/>
+          <w:szCs w:val="22"/>
+        </w:rPr>
+        <w:t>were</w:t>
+      </w:r>
+      <w:proofErr w:type="gramEnd"/>
+      <w:r>
+        <w:rPr>
+          <w:b/>
+          <w:sz w:val="22"/>
+          <w:szCs w:val="22"/>
+        </w:rPr>
+        <w:t xml:space="preserve"> any obstacles, what methods have been considered or practiced </w:t>
+      </w:r>
+      <w:proofErr w:type="gramStart"/>
+      <w:r>
+        <w:rPr>
+          <w:b/>
+          <w:sz w:val="22"/>
+          <w:szCs w:val="22"/>
+        </w:rPr>
+        <w:t>to improve</w:t>
+      </w:r>
+      <w:proofErr w:type="gramEnd"/>
+      <w:r>
+        <w:rPr>
+          <w:b/>
+          <w:sz w:val="22"/>
+          <w:szCs w:val="22"/>
+        </w:rPr>
+        <w:t xml:space="preserve"> the situation? If practiced, did it work?</w:t>
+      </w:r>
+    </w:p>
+    <w:p>
+      <w:r>
+        <w:rPr>
+          <w:b/>
+          <w:sz w:val="22"/>
+          <w:szCs w:val="22"/>
+        </w:rPr>
+        <w:t>1</w:t>
+      </w:r>
+      <w:r>
+        <w:rPr>
+          <w:b/>
+          <w:sz w:val="22"/>
+          <w:szCs w:val="22"/>
+        </w:rPr>
+        <w:t>2</w:t>
+      </w:r>
+      <w:r>
+        <w:rPr>
+          <w:b/>
+          <w:sz w:val="22"/>
+          <w:szCs w:val="22"/>
+        </w:rPr>
+        <w:t xml:space="preserve">. When designing the software, did you consider the ease of future changes? For example, will it be hard to change the structure of the system, modules or code blocks? What measures have been taken to ensure the ease of future changes and </w:t>
+      </w:r>
+      <w:r>
+        <w:rPr>
+          <w:b/>
+          <w:sz w:val="22"/>
+          <w:szCs w:val="22"/>
+        </w:rPr>
+        <w:t>maintenance</w:t>
+      </w:r>
+      <w:r>
+        <w:rPr>
+          <w:b/>
+          <w:sz w:val="22"/>
+          <w:szCs w:val="22"/>
+        </w:rPr>
+        <w:t>?</w:t>
+      </w:r>
+    </w:p>
+    <w:p>
+      <w:pPr>
+        <w:rPr>
+          <w:b/>
+          <w:sz w:val="22"/>
+          <w:szCs w:val="22"/>
+        </w:rPr>
+      </w:pPr>
+      <w:r>
+        <w:rPr>
+          <w:b/>
+          <w:sz w:val="22"/>
+          <w:szCs w:val="22"/>
+        </w:rPr>
+        <w:t xml:space="preserve">13. Do you have any concern that your computational results won’t be reproducible in the future? </w:t>
+      </w:r>
+      <w:r>
+        <w:rPr>
+          <w:b/>
+          <w:sz w:val="22"/>
+          <w:szCs w:val="22"/>
+        </w:rPr>
+        <w:t xml:space="preserve"> Reproducibility is defined as </w:t>
+      </w:r>
+      <w:r>
+        <w:rPr>
+          <w:b/>
+          <w:sz w:val="22"/>
+          <w:szCs w:val="22"/>
+        </w:rPr>
+        <w:t xml:space="preserve">the ability to obtain the exact same computational results </w:t>
+      </w:r>
+      <w:r>
+        <w:rPr>
+          <w:b/>
+          <w:sz w:val="22"/>
+          <w:szCs w:val="22"/>
+        </w:rPr>
+        <w:t xml:space="preserve">in the future </w:t>
+      </w:r>
+      <w:r>
+        <w:rPr>
+          <w:b/>
+          <w:sz w:val="22"/>
+          <w:szCs w:val="22"/>
+        </w:rPr>
+        <w:t>using the original dataset, code, software environment, and analytical steps</w:t>
+      </w:r>
+      <w:r>
+        <w:rPr>
+          <w:b/>
+          <w:sz w:val="22"/>
+          <w:szCs w:val="22"/>
+        </w:rPr>
+        <w:t xml:space="preserve">. </w:t>
+      </w:r>
+      <w:r>
+        <w:rPr>
+          <w:b/>
+          <w:sz w:val="22"/>
+          <w:szCs w:val="22"/>
+        </w:rPr>
+        <w:t xml:space="preserve">Have you taken any steps to ensure reproducibility? </w:t>
+      </w:r>
+    </w:p>
+    <w:p>
+      <w:pPr>
+        <w:rPr>
+          <w:b/>
+          <w:sz w:val="22"/>
+          <w:szCs w:val="22"/>
+        </w:rPr>
+      </w:pPr>
+      <w:r>
+        <w:rPr>
+          <w:b/>
+          <w:sz w:val="22"/>
+          <w:szCs w:val="22"/>
+        </w:rPr>
+        <w:t xml:space="preserve">14. What positive contributions do LLM-based tools have </w:t>
+      </w:r>
+      <w:proofErr w:type="gramStart"/>
+      <w:r>
+        <w:rPr>
+          <w:b/>
+          <w:sz w:val="22"/>
+          <w:szCs w:val="22"/>
+        </w:rPr>
+        <w:t>on</w:t>
+      </w:r>
+      <w:proofErr w:type="gramEnd"/>
+      <w:r>
+        <w:rPr>
+          <w:b/>
+          <w:sz w:val="22"/>
+          <w:szCs w:val="22"/>
+        </w:rPr>
+        <w:t xml:space="preserve"> </w:t>
+      </w:r>
+      <w:r>
+        <w:rPr>
+          <w:rFonts w:hint="eastAsia"/>
+          <w:b/>
+          <w:sz w:val="22"/>
+          <w:szCs w:val="22"/>
+        </w:rPr>
+        <w:t xml:space="preserve">the </w:t>
+      </w:r>
+      <w:r>
+        <w:rPr>
+          <w:b/>
+          <w:sz w:val="22"/>
+          <w:szCs w:val="22"/>
+        </w:rPr>
+        <w:t>development process</w:t>
+      </w:r>
+      <w:r>
+        <w:rPr>
+          <w:b/>
+          <w:sz w:val="22"/>
+          <w:szCs w:val="22"/>
+        </w:rPr>
+        <w:t>?</w:t>
+      </w:r>
+    </w:p>
+    <w:p>
+      <w:r>
+        <w:rPr>
+          <w:b/>
+          <w:sz w:val="22"/>
+          <w:szCs w:val="22"/>
+        </w:rPr>
+        <w:t>15. What negatives are associated with LLM-based tools?</w:t>
+      </w:r>
+    </w:p>
+    <w:p>
+      <w:pPr>
+        <w:rPr>
+          <w:b/>
+          <w:sz w:val="22"/>
+          <w:szCs w:val="22"/>
+        </w:rPr>
+      </w:pPr>
+    </w:p>
+    <w:p>
+      <w:pPr>
+        <w:rPr>
+          <w:b/>
+          <w:sz w:val="22"/>
+          <w:szCs w:val="22"/>
+        </w:rPr>
+      </w:pPr>
+      <w:r>
+        <w:rPr>
+          <w:b/>
+          <w:sz w:val="22"/>
+          <w:szCs w:val="22"/>
+        </w:rPr>
+        <w:t>Questions about Users</w:t>
+      </w:r>
+    </w:p>
+    <w:p>
+      <w:pPr>
+        <w:rPr>
+          <w:b/>
+          <w:sz w:val="22"/>
+          <w:szCs w:val="22"/>
+        </w:rPr>
+      </w:pPr>
+    </w:p>
+    <w:p>
+      <w:r>
+        <w:rPr>
+          <w:b/>
+          <w:sz w:val="22"/>
+          <w:szCs w:val="22"/>
+        </w:rPr>
+        <w:t>1</w:t>
+      </w:r>
+      <w:r>
+        <w:rPr>
+          <w:b/>
+          <w:sz w:val="22"/>
+          <w:szCs w:val="22"/>
+        </w:rPr>
         <w:t>6</w:t>
       </w:r>
       <w:r>
@@ -272,17 +701,18 @@
           <w:sz w:val="22"/>
           <w:szCs w:val="22"/>
         </w:rPr>
-        <w:t>. What is your software development model? For example, waterfall, agile, etc.</w:t>
-      </w:r>
-    </w:p>
-    <w:p>
-      <w:pPr>
-        <w:rPr>
-          <w:b/>
-          <w:sz w:val="22"/>
-          <w:szCs w:val="22"/>
-        </w:rPr>
-      </w:pPr>
+        <w:t>. What is the typical background of a user?</w:t>
+      </w:r>
+    </w:p>
+    <w:p>
+      <w:r>
+        <w:rPr>
+          <w:b/>
+          <w:sz w:val="22"/>
+          <w:szCs w:val="22"/>
+        </w:rPr>
+        <w:t>1</w:t>
+      </w:r>
       <w:r>
         <w:rPr>
           <w:b/>
@@ -297,565 +727,169 @@
           <w:sz w:val="22"/>
           <w:szCs w:val="22"/>
         </w:rPr>
-        <w:t xml:space="preserve">. What is your project management process? </w:t>
-      </w:r>
-      <w:r>
-        <w:rPr>
-          <w:b/>
-          <w:sz w:val="22"/>
-          <w:szCs w:val="22"/>
-        </w:rPr>
+        <w:t xml:space="preserve">. Provide instances where users have misunderstood </w:t>
+      </w:r>
+      <w:r>
+        <w:rPr>
+          <w:b/>
+          <w:sz w:val="22"/>
+          <w:szCs w:val="22"/>
+        </w:rPr>
+        <w:t xml:space="preserve">or misused </w:t>
+      </w:r>
+      <w:r>
+        <w:rPr>
+          <w:b/>
+          <w:sz w:val="22"/>
+          <w:szCs w:val="22"/>
+        </w:rPr>
+        <w:t xml:space="preserve">the software. What, if any, actions were taken to address </w:t>
+      </w:r>
+      <w:r>
+        <w:rPr>
+          <w:b/>
+          <w:sz w:val="22"/>
+          <w:szCs w:val="22"/>
+        </w:rPr>
+        <w:t>usability</w:t>
+      </w:r>
+      <w:r>
+        <w:rPr>
+          <w:b/>
+          <w:sz w:val="22"/>
+          <w:szCs w:val="22"/>
+        </w:rPr>
+        <w:t xml:space="preserve"> issues?</w:t>
+      </w:r>
+    </w:p>
+    <w:p>
+      <w:pPr>
+        <w:rPr>
+          <w:rFonts w:eastAsia="等线"/>
+          <w:b/>
+          <w:sz w:val="22"/>
+          <w:szCs w:val="22"/>
+        </w:rPr>
+      </w:pPr>
+      <w:r>
+        <w:rPr>
+          <w:b/>
+          <w:sz w:val="22"/>
+          <w:szCs w:val="22"/>
+        </w:rPr>
+        <w:t>1</w:t>
+      </w:r>
+      <w:r>
+        <w:rPr>
+          <w:b/>
+          <w:sz w:val="22"/>
+          <w:szCs w:val="22"/>
+        </w:rPr>
+        <w:t>8</w:t>
+      </w:r>
+      <w:r>
+        <w:rPr>
+          <w:b/>
+          <w:sz w:val="22"/>
+          <w:szCs w:val="22"/>
+        </w:rPr>
+        <w:t xml:space="preserve">. Do you think the current documentation can clearly convey all necessary knowledge to the users? If yes, how did you successfully achieve it? If </w:t>
+      </w:r>
+      <w:proofErr w:type="gramStart"/>
+      <w:r>
+        <w:rPr>
+          <w:b/>
+          <w:sz w:val="22"/>
+          <w:szCs w:val="22"/>
+        </w:rPr>
+        <w:t>no</w:t>
+      </w:r>
+      <w:proofErr w:type="gramEnd"/>
+      <w:r>
+        <w:rPr>
+          <w:b/>
+          <w:sz w:val="22"/>
+          <w:szCs w:val="22"/>
+        </w:rPr>
+        <w:t>, what improvements are needed?</w:t>
+      </w:r>
+    </w:p>
+    <w:p>
+      <w:pPr>
+        <w:rPr>
+          <w:rFonts w:eastAsia="等线"/>
+        </w:rPr>
+      </w:pPr>
+      <w:r>
+        <w:rPr>
+          <w:rFonts w:eastAsia="等线" w:hint="eastAsia"/>
+          <w:b/>
+          <w:sz w:val="22"/>
+          <w:szCs w:val="22"/>
+        </w:rPr>
+        <w:t>19.</w:t>
+      </w:r>
+      <w:r>
         <w:t xml:space="preserve"> </w:t>
       </w:r>
       <w:r>
         <w:rPr>
-          <w:b/>
-          <w:sz w:val="22"/>
-          <w:szCs w:val="22"/>
-        </w:rPr>
-        <w:t>How is git used?</w:t>
-      </w:r>
-      <w:r>
-        <w:rPr>
-          <w:b/>
-          <w:sz w:val="22"/>
-          <w:szCs w:val="22"/>
-        </w:rPr>
-        <w:t xml:space="preserve"> </w:t>
-      </w:r>
-      <w:r>
-        <w:rPr>
-          <w:b/>
-          <w:sz w:val="22"/>
-          <w:szCs w:val="22"/>
-        </w:rPr>
-        <w:t xml:space="preserve">Are </w:t>
-      </w:r>
-      <w:r>
-        <w:rPr>
-          <w:b/>
-          <w:sz w:val="22"/>
-          <w:szCs w:val="22"/>
-        </w:rPr>
-        <w:t xml:space="preserve">there other </w:t>
-      </w:r>
-      <w:r>
-        <w:rPr>
-          <w:b/>
-          <w:sz w:val="22"/>
-          <w:szCs w:val="22"/>
-        </w:rPr>
-        <w:t>project management tools?</w:t>
-      </w:r>
-      <w:r>
-        <w:rPr>
-          <w:b/>
-          <w:sz w:val="22"/>
-          <w:szCs w:val="22"/>
-        </w:rPr>
-        <w:t xml:space="preserve"> </w:t>
-      </w:r>
-    </w:p>
-    <w:p>
-      <w:r>
-        <w:rPr>
-          <w:b/>
-          <w:sz w:val="22"/>
-          <w:szCs w:val="22"/>
-        </w:rPr>
-        <w:t>8</w:t>
-      </w:r>
-      <w:r>
-        <w:rPr>
-          <w:b/>
-          <w:sz w:val="22"/>
-          <w:szCs w:val="22"/>
-        </w:rPr>
-        <w:t xml:space="preserve">. Currently, what are the most significant </w:t>
-      </w:r>
-      <w:r>
-        <w:rPr>
-          <w:b/>
-          <w:sz w:val="22"/>
-          <w:szCs w:val="22"/>
-        </w:rPr>
-        <w:t xml:space="preserve">pain points </w:t>
-      </w:r>
-      <w:r>
-        <w:rPr>
-          <w:b/>
-          <w:sz w:val="22"/>
-          <w:szCs w:val="22"/>
-        </w:rPr>
-        <w:t xml:space="preserve">in your development process?  Specifically, what are the pain points in the following </w:t>
-      </w:r>
-      <w:r>
-        <w:rPr>
-          <w:b/>
-          <w:sz w:val="22"/>
-          <w:szCs w:val="22"/>
-        </w:rPr>
-        <w:t>stages</w:t>
-      </w:r>
-      <w:r>
-        <w:rPr>
-          <w:b/>
-          <w:sz w:val="22"/>
-          <w:szCs w:val="22"/>
-        </w:rPr>
-        <w:t xml:space="preserve"> of the development process: a) requirements definition (defining what the software should do), b) design, c) implementation, and d) verification.</w:t>
-      </w:r>
-    </w:p>
-    <w:p>
-      <w:r>
-        <w:rPr>
-          <w:b/>
-          <w:sz w:val="22"/>
-          <w:szCs w:val="22"/>
-        </w:rPr>
-        <w:t>9</w:t>
-      </w:r>
-      <w:r>
-        <w:rPr>
-          <w:b/>
-          <w:sz w:val="22"/>
-          <w:szCs w:val="22"/>
-        </w:rPr>
-        <w:t xml:space="preserve">. How does documentation fit into your development process? Would </w:t>
-      </w:r>
-      <w:proofErr w:type="spellStart"/>
-      <w:r>
-        <w:rPr>
-          <w:b/>
-          <w:sz w:val="22"/>
-          <w:szCs w:val="22"/>
-        </w:rPr>
-        <w:t>improved</w:t>
-      </w:r>
-      <w:proofErr w:type="spellEnd"/>
-      <w:r>
-        <w:rPr>
-          <w:b/>
-          <w:sz w:val="22"/>
-          <w:szCs w:val="22"/>
-        </w:rPr>
-        <w:t xml:space="preserve"> documentation help with the obstacles you typically face?</w:t>
-      </w:r>
-    </w:p>
-    <w:p>
-      <w:r>
-        <w:rPr>
-          <w:b/>
-          <w:sz w:val="22"/>
-          <w:szCs w:val="22"/>
-        </w:rPr>
-        <w:t>10</w:t>
-      </w:r>
-      <w:r>
-        <w:rPr>
-          <w:b/>
-          <w:sz w:val="22"/>
-          <w:szCs w:val="22"/>
-        </w:rPr>
-        <w:t>. In the past, is there any major obstacle to your development process that has been solved? How did you solve it?</w:t>
-      </w:r>
-    </w:p>
-    <w:p>
-      <w:r>
-        <w:rPr>
-          <w:b/>
-          <w:sz w:val="22"/>
-          <w:szCs w:val="22"/>
-        </w:rPr>
-        <w:t>1</w:t>
-      </w:r>
-      <w:r>
-        <w:rPr>
-          <w:b/>
-          <w:sz w:val="22"/>
-          <w:szCs w:val="22"/>
-        </w:rPr>
-        <w:t>1</w:t>
-      </w:r>
-      <w:r>
-        <w:rPr>
-          <w:b/>
-          <w:sz w:val="22"/>
-          <w:szCs w:val="22"/>
-        </w:rPr>
-        <w:t xml:space="preserve">. </w:t>
-      </w:r>
-      <w:r>
-        <w:rPr>
-          <w:b/>
-          <w:sz w:val="22"/>
-          <w:szCs w:val="22"/>
-        </w:rPr>
-        <w:t xml:space="preserve">Is </w:t>
-      </w:r>
-      <w:r>
-        <w:rPr>
-          <w:b/>
-          <w:sz w:val="22"/>
-          <w:szCs w:val="22"/>
-        </w:rPr>
-        <w:t xml:space="preserve">it hard to ensure the correctness of the software? If there were any obstacles, what methods have been considered or practiced </w:t>
-      </w:r>
-      <w:proofErr w:type="gramStart"/>
-      <w:r>
-        <w:rPr>
-          <w:b/>
-          <w:sz w:val="22"/>
-          <w:szCs w:val="22"/>
-        </w:rPr>
-        <w:t>to improve</w:t>
-      </w:r>
-      <w:proofErr w:type="gramEnd"/>
-      <w:r>
-        <w:rPr>
-          <w:b/>
-          <w:sz w:val="22"/>
-          <w:szCs w:val="22"/>
-        </w:rPr>
-        <w:t xml:space="preserve"> the situation? If practiced, did it work?</w:t>
-      </w:r>
-    </w:p>
-    <w:p>
-      <w:r>
-        <w:rPr>
-          <w:b/>
-          <w:sz w:val="22"/>
-          <w:szCs w:val="22"/>
-        </w:rPr>
-        <w:t>1</w:t>
-      </w:r>
-      <w:r>
-        <w:rPr>
-          <w:b/>
-          <w:sz w:val="22"/>
-          <w:szCs w:val="22"/>
-        </w:rPr>
-        <w:t>2</w:t>
-      </w:r>
-      <w:r>
-        <w:rPr>
-          <w:b/>
-          <w:sz w:val="22"/>
-          <w:szCs w:val="22"/>
-        </w:rPr>
-        <w:t xml:space="preserve">. When designing the software, did you consider the ease of future changes? For example, will it be hard to change the structure of the system, modules or code blocks? What measures have been taken to ensure the ease of future changes and </w:t>
-      </w:r>
-      <w:r>
-        <w:rPr>
-          <w:b/>
-          <w:sz w:val="22"/>
-          <w:szCs w:val="22"/>
-        </w:rPr>
-        <w:t>maintenance</w:t>
-      </w:r>
-      <w:r>
-        <w:rPr>
-          <w:b/>
-          <w:sz w:val="22"/>
-          <w:szCs w:val="22"/>
-        </w:rPr>
-        <w:t>?</w:t>
-      </w:r>
-    </w:p>
-    <w:p>
-      <w:pPr>
-        <w:rPr>
-          <w:b/>
-          <w:sz w:val="22"/>
-          <w:szCs w:val="22"/>
-        </w:rPr>
-      </w:pPr>
-      <w:r>
-        <w:rPr>
-          <w:b/>
-          <w:sz w:val="22"/>
-          <w:szCs w:val="22"/>
-        </w:rPr>
-        <w:t xml:space="preserve">13. Do you have any concern that your computational results won’t be reproducible in the future? </w:t>
-      </w:r>
-      <w:r>
-        <w:rPr>
-          <w:b/>
-          <w:sz w:val="22"/>
-          <w:szCs w:val="22"/>
-        </w:rPr>
-        <w:t xml:space="preserve"> Reproducibility is defined as </w:t>
-      </w:r>
-      <w:r>
-        <w:rPr>
-          <w:b/>
-          <w:sz w:val="22"/>
-          <w:szCs w:val="22"/>
-        </w:rPr>
-        <w:t xml:space="preserve">the ability to obtain the exact same computational results </w:t>
-      </w:r>
-      <w:r>
-        <w:rPr>
-          <w:b/>
-          <w:sz w:val="22"/>
-          <w:szCs w:val="22"/>
-        </w:rPr>
-        <w:t xml:space="preserve">in the future </w:t>
-      </w:r>
-      <w:r>
-        <w:rPr>
-          <w:b/>
-          <w:sz w:val="22"/>
-          <w:szCs w:val="22"/>
-        </w:rPr>
-        <w:t>using the original dataset, code, software environment, and analytical steps</w:t>
-      </w:r>
-      <w:r>
-        <w:rPr>
-          <w:b/>
-          <w:sz w:val="22"/>
-          <w:szCs w:val="22"/>
-        </w:rPr>
-        <w:t xml:space="preserve">. </w:t>
-      </w:r>
-      <w:r>
-        <w:rPr>
-          <w:b/>
-          <w:sz w:val="22"/>
-          <w:szCs w:val="22"/>
-        </w:rPr>
-        <w:t xml:space="preserve">Have you taken any steps to ensure reproducibility? </w:t>
-      </w:r>
-    </w:p>
-    <w:p>
-      <w:pPr>
-        <w:rPr>
-          <w:b/>
-          <w:sz w:val="22"/>
-          <w:szCs w:val="22"/>
-        </w:rPr>
-      </w:pPr>
-      <w:r>
-        <w:rPr>
-          <w:b/>
-          <w:sz w:val="22"/>
-          <w:szCs w:val="22"/>
-        </w:rPr>
-        <w:t>14. What positive contributions do LLM-based tools have on your development process</w:t>
-      </w:r>
-      <w:r>
-        <w:rPr>
-          <w:b/>
-          <w:sz w:val="22"/>
-          <w:szCs w:val="22"/>
-        </w:rPr>
-        <w:t>?</w:t>
-      </w:r>
-    </w:p>
-    <w:p>
-      <w:r>
-        <w:rPr>
-          <w:b/>
-          <w:sz w:val="22"/>
-          <w:szCs w:val="22"/>
-        </w:rPr>
-        <w:t>15. What negatives are associated with LLM-based tools?</w:t>
-      </w:r>
-    </w:p>
-    <w:p>
-      <w:pPr>
-        <w:rPr>
-          <w:b/>
-          <w:sz w:val="22"/>
-          <w:szCs w:val="22"/>
-        </w:rPr>
-      </w:pPr>
-    </w:p>
-    <w:p>
-      <w:pPr>
-        <w:rPr>
-          <w:b/>
-          <w:sz w:val="22"/>
-          <w:szCs w:val="22"/>
-        </w:rPr>
-      </w:pPr>
-      <w:r>
-        <w:rPr>
-          <w:b/>
-          <w:sz w:val="22"/>
-          <w:szCs w:val="22"/>
-        </w:rPr>
-        <w:t>Questions about Users</w:t>
-      </w:r>
-    </w:p>
-    <w:p>
-      <w:pPr>
-        <w:rPr>
-          <w:b/>
-          <w:sz w:val="22"/>
-          <w:szCs w:val="22"/>
-        </w:rPr>
-      </w:pPr>
-    </w:p>
-    <w:p>
-      <w:r>
-        <w:rPr>
-          <w:b/>
-          <w:sz w:val="22"/>
-          <w:szCs w:val="22"/>
-        </w:rPr>
-        <w:t>1</w:t>
-      </w:r>
-      <w:r>
-        <w:rPr>
-          <w:b/>
-          <w:sz w:val="22"/>
-          <w:szCs w:val="22"/>
-        </w:rPr>
-        <w:t>6</w:t>
-      </w:r>
-      <w:r>
-        <w:rPr>
-          <w:b/>
-          <w:sz w:val="22"/>
-          <w:szCs w:val="22"/>
-        </w:rPr>
-        <w:t>. What is the typical background of a user?</w:t>
-      </w:r>
-    </w:p>
-    <w:p>
-      <w:r>
-        <w:rPr>
-          <w:b/>
-          <w:sz w:val="22"/>
-          <w:szCs w:val="22"/>
-        </w:rPr>
-        <w:t>1</w:t>
-      </w:r>
-      <w:r>
-        <w:rPr>
-          <w:b/>
-          <w:sz w:val="22"/>
-          <w:szCs w:val="22"/>
-        </w:rPr>
-        <w:t>7</w:t>
-      </w:r>
-      <w:r>
-        <w:rPr>
-          <w:b/>
-          <w:sz w:val="22"/>
-          <w:szCs w:val="22"/>
-        </w:rPr>
-        <w:t xml:space="preserve">. Provide instances where users have misunderstood </w:t>
-      </w:r>
-      <w:r>
-        <w:rPr>
-          <w:b/>
-          <w:sz w:val="22"/>
-          <w:szCs w:val="22"/>
-        </w:rPr>
-        <w:t xml:space="preserve">or misused </w:t>
-      </w:r>
-      <w:r>
-        <w:rPr>
-          <w:b/>
-          <w:sz w:val="22"/>
-          <w:szCs w:val="22"/>
-        </w:rPr>
-        <w:t xml:space="preserve">the software. What, if any, actions were taken to address </w:t>
-      </w:r>
-      <w:r>
-        <w:rPr>
-          <w:b/>
-          <w:sz w:val="22"/>
-          <w:szCs w:val="22"/>
-        </w:rPr>
-        <w:t>usability</w:t>
-      </w:r>
-      <w:r>
-        <w:rPr>
-          <w:b/>
-          <w:sz w:val="22"/>
-          <w:szCs w:val="22"/>
-        </w:rPr>
-        <w:t xml:space="preserve"> issues?</w:t>
-      </w:r>
-    </w:p>
-    <w:p>
-      <w:r>
-        <w:rPr>
-          <w:b/>
-          <w:sz w:val="22"/>
-          <w:szCs w:val="22"/>
-        </w:rPr>
-        <w:t>1</w:t>
-      </w:r>
-      <w:r>
-        <w:rPr>
-          <w:b/>
-          <w:sz w:val="22"/>
-          <w:szCs w:val="22"/>
-        </w:rPr>
-        <w:t>8</w:t>
-      </w:r>
-      <w:r>
-        <w:rPr>
-          <w:b/>
-          <w:sz w:val="22"/>
-          <w:szCs w:val="22"/>
-        </w:rPr>
-        <w:t>. Do you think the current documentation can clearly convey all necessary knowledge to the users? If yes, how did you successfully achieve it? If no, what improvements are needed?</w:t>
-      </w:r>
-    </w:p>
-    <w:p>
-      <w:pPr>
-        <w:rPr>
+          <w:rFonts w:eastAsia="等线"/>
+          <w:b/>
+          <w:sz w:val="22"/>
+          <w:szCs w:val="22"/>
+        </w:rPr>
+        <w:t>How do you learn about and understand the needs of your users?</w:t>
+      </w:r>
+      <w:r>
+        <w:rPr>
+          <w:rFonts w:eastAsia="等线"/>
+          <w:b/>
+          <w:sz w:val="22"/>
+          <w:szCs w:val="22"/>
+        </w:rPr>
+        <w:t xml:space="preserve"> What channels </w:t>
+      </w:r>
+      <w:r>
+        <w:rPr>
+          <w:rFonts w:eastAsia="等线" w:hint="eastAsia"/>
+          <w:b/>
+          <w:sz w:val="22"/>
+          <w:szCs w:val="22"/>
+        </w:rPr>
+        <w:t>do you</w:t>
+      </w:r>
+      <w:r>
+        <w:rPr>
+          <w:rFonts w:eastAsia="等线"/>
+          <w:b/>
+          <w:sz w:val="22"/>
+          <w:szCs w:val="22"/>
+        </w:rPr>
+        <w:t xml:space="preserve"> use to gather user feedback?</w:t>
+      </w:r>
+    </w:p>
+    <w:p>
+      <w:pPr>
+        <w:jc w:val="center"/>
+        <w:rPr>
+          <w:rFonts w:eastAsia="等线" w:hint="eastAsia"/>
           <w:b/>
           <w:sz w:val="18"/>
           <w:szCs w:val="18"/>
         </w:rPr>
       </w:pPr>
-    </w:p>
-    <w:p>
-      <w:pPr>
-        <w:jc w:val="center"/>
+      <w:r>
         <w:rPr>
           <w:b/>
           <w:sz w:val="18"/>
           <w:szCs w:val="18"/>
         </w:rPr>
-      </w:pPr>
-      <w:r>
-        <w:rPr>
-          <w:b/>
-          <w:sz w:val="18"/>
-          <w:szCs w:val="18"/>
-        </w:rPr>
         <w:t>END</w:t>
       </w:r>
     </w:p>
-    <w:p>
-      <w:pPr>
-        <w:rPr>
-          <w:sz w:val="16"/>
-          <w:szCs w:val="16"/>
-        </w:rPr>
-      </w:pPr>
-      <w:r>
-        <w:rPr>
-          <w:sz w:val="16"/>
-          <w:szCs w:val="16"/>
-        </w:rPr>
-        <w:t xml:space="preserve">  </w:t>
-      </w:r>
-    </w:p>
     <w:sectPr>
-      <w:headerReference w:type="even" r:id="rId7"/>
-      <w:headerReference w:type="default" r:id="rId8"/>
-      <w:footerReference w:type="even" r:id="rId9"/>
-      <w:footerReference w:type="default" r:id="rId10"/>
-      <w:headerReference w:type="first" r:id="rId11"/>
-      <w:footerReference w:type="first" r:id="rId12"/>
+      <w:footerReference w:type="default" r:id="rId7"/>
       <w:pgSz w:w="12240" w:h="15840"/>
       <w:pgMar w:top="1021" w:right="1361" w:bottom="1021" w:left="1361" w:header="709" w:footer="709" w:gutter="0"/>
       <w:cols w:space="720"/>
@@ -867,7 +901,7 @@
 </file>
 
 <file path=word/endnotes.xml><?xml version="1.0" encoding="utf-8"?>
-<w:endnotes xmlns:wpc="http://schemas.microsoft.com/office/word/2010/wordprocessingCanvas" xmlns:cx="http://schemas.microsoft.com/office/drawing/2014/chartex" xmlns:cx1="http://schemas.microsoft.com/office/drawing/2015/9/8/chartex" xmlns:cx2="http://schemas.microsoft.com/office/drawing/2015/10/21/chartex" xmlns:cx3="http://schemas.microsoft.com/office/drawing/2016/5/9/chartex" xmlns:cx4="http://schemas.microsoft.com/office/drawing/2016/5/10/chartex" xmlns:cx5="http://schemas.microsoft.com/office/drawing/2016/5/11/chartex" xmlns:cx6="http://schemas.microsoft.com/office/drawing/2016/5/12/chartex" xmlns:cx7="http://schemas.microsoft.com/office/drawing/2016/5/13/chartex" xmlns:cx8="http://schemas.microsoft.com/office/drawing/2016/5/14/chartex" xmlns:mc="http://schemas.openxmlformats.org/markup-compatibility/2006" xmlns:m="http://schemas.openxmlformats.org/officeDocument/2006/math" xmlns:aink="http://schemas.microsoft.com/office/drawing/2016/ink" xmlns:am3d="http://schemas.microsoft.com/office/drawing/2017/model3d" xmlns:oel="http://schemas.microsoft.com/office/2019/extlst" xmlns:r="http://schemas.openxmlformats.org/officeDocument/2006/relationships" xmlns:wp14="http://schemas.microsoft.com/office/word/2010/wordprocessingDrawing" xmlns:wp="http://schemas.openxmlformats.org/drawingml/2006/wordprocessingDrawing" xmlns:wpg="http://schemas.microsoft.com/office/word/2010/wordprocessingGroup" xmlns:wpi="http://schemas.microsoft.com/office/word/2010/wordprocessingInk" xmlns:wps="http://schemas.microsoft.com/office/word/2010/wordprocessingShape" xmlns:o="urn:schemas-microsoft-com:office:office" xmlns:v="urn:schemas-microsoft-com:vml" xmlns:w10="urn:schemas-microsoft-com:office:word" xmlns:w="http://schemas.openxmlformats.org/wordprocessingml/2006/main" xmlns:w14="http://schemas.microsoft.com/office/word/2010/wordml" xmlns:w15="http://schemas.microsoft.com/office/word/2012/wordml" xmlns:w16cex="http://schemas.microsoft.com/office/word/2018/wordml/cex" xmlns:w16cid="http://schemas.microsoft.com/office/word/2016/wordml/cid" xmlns:w16="http://schemas.microsoft.com/office/word/2018/wordml" xmlns:w16sdtdh="http://schemas.microsoft.com/office/word/2020/wordml/sdtdatahash" xmlns:w16sdtfl="http://schemas.microsoft.com/office/word/2024/wordml/sdtformatlock" xmlns:w16se="http://schemas.microsoft.com/office/word/2015/wordml/symex" xmlns:w16du="http://schemas.microsoft.com/office/word/2023/wordml/word16du" xmlns:wne="http://schemas.microsoft.com/office/word/2006/wordml" mc:Ignorable="w14 w15 w16se w16cid w16 w16cex w16sdtdh w16sdtfl w16du wp14">
+<w:endnotes xmlns:wpc="http://schemas.microsoft.com/office/word/2010/wordprocessingCanvas" xmlns:cx="http://schemas.microsoft.com/office/drawing/2014/chartex" xmlns:cx1="http://schemas.microsoft.com/office/drawing/2015/9/8/chartex" xmlns:cx2="http://schemas.microsoft.com/office/drawing/2015/10/21/chartex" xmlns:cx3="http://schemas.microsoft.com/office/drawing/2016/5/9/chartex" xmlns:cx4="http://schemas.microsoft.com/office/drawing/2016/5/10/chartex" xmlns:cx5="http://schemas.microsoft.com/office/drawing/2016/5/11/chartex" xmlns:cx6="http://schemas.microsoft.com/office/drawing/2016/5/12/chartex" xmlns:cx7="http://schemas.microsoft.com/office/drawing/2016/5/13/chartex" xmlns:cx8="http://schemas.microsoft.com/office/drawing/2016/5/14/chartex" xmlns:mc="http://schemas.openxmlformats.org/markup-compatibility/2006" xmlns:aink="http://schemas.microsoft.com/office/drawing/2016/ink" xmlns:am3d="http://schemas.microsoft.com/office/drawing/2017/model3d" xmlns:o="urn:schemas-microsoft-com:office:office" xmlns:oel="http://schemas.microsoft.com/office/2019/extlst" xmlns:r="http://schemas.openxmlformats.org/officeDocument/2006/relationships" xmlns:m="http://schemas.openxmlformats.org/officeDocument/2006/math" xmlns:v="urn:schemas-microsoft-com:vml" xmlns:wp14="http://schemas.microsoft.com/office/word/2010/wordprocessingDrawing" xmlns:wp="http://schemas.openxmlformats.org/drawingml/2006/wordprocessingDrawing" xmlns:w10="urn:schemas-microsoft-com:office:word" xmlns:w="http://schemas.openxmlformats.org/wordprocessingml/2006/main" xmlns:w14="http://schemas.microsoft.com/office/word/2010/wordml" xmlns:w15="http://schemas.microsoft.com/office/word/2012/wordml" xmlns:w16cex="http://schemas.microsoft.com/office/word/2018/wordml/cex" xmlns:w16cid="http://schemas.microsoft.com/office/word/2016/wordml/cid" xmlns:w16="http://schemas.microsoft.com/office/word/2018/wordml" xmlns:w16du="http://schemas.microsoft.com/office/word/2023/wordml/word16du" xmlns:w16sdtdh="http://schemas.microsoft.com/office/word/2020/wordml/sdtdatahash" xmlns:w16sdtfl="http://schemas.microsoft.com/office/word/2024/wordml/sdtformatlock" xmlns:w16se="http://schemas.microsoft.com/office/word/2015/wordml/symex" xmlns:wpg="http://schemas.microsoft.com/office/word/2010/wordprocessingGroup" xmlns:wpi="http://schemas.microsoft.com/office/word/2010/wordprocessingInk" xmlns:wne="http://schemas.microsoft.com/office/word/2006/wordml" xmlns:wps="http://schemas.microsoft.com/office/word/2010/wordprocessingShape" mc:Ignorable="w14 w15 w16se w16cid w16 w16cex w16sdtdh w16sdtfl w16du wp14">
   <w:endnote w:type="separator" w:id="-1">
     <w:p>
       <w:r>
@@ -886,20 +920,10 @@
 </file>
 
 <file path=word/footer1.xml><?xml version="1.0" encoding="utf-8"?>
-<w:ftr xmlns:wpc="http://schemas.microsoft.com/office/word/2010/wordprocessingCanvas" xmlns:cx="http://schemas.microsoft.com/office/drawing/2014/chartex" xmlns:cx1="http://schemas.microsoft.com/office/drawing/2015/9/8/chartex" xmlns:cx2="http://schemas.microsoft.com/office/drawing/2015/10/21/chartex" xmlns:cx3="http://schemas.microsoft.com/office/drawing/2016/5/9/chartex" xmlns:cx4="http://schemas.microsoft.com/office/drawing/2016/5/10/chartex" xmlns:cx5="http://schemas.microsoft.com/office/drawing/2016/5/11/chartex" xmlns:cx6="http://schemas.microsoft.com/office/drawing/2016/5/12/chartex" xmlns:cx7="http://schemas.microsoft.com/office/drawing/2016/5/13/chartex" xmlns:cx8="http://schemas.microsoft.com/office/drawing/2016/5/14/chartex" xmlns:mc="http://schemas.openxmlformats.org/markup-compatibility/2006" xmlns:m="http://schemas.openxmlformats.org/officeDocument/2006/math" xmlns:aink="http://schemas.microsoft.com/office/drawing/2016/ink" xmlns:am3d="http://schemas.microsoft.com/office/drawing/2017/model3d" xmlns:oel="http://schemas.microsoft.com/office/2019/extlst" xmlns:r="http://schemas.openxmlformats.org/officeDocument/2006/relationships" xmlns:wp14="http://schemas.microsoft.com/office/word/2010/wordprocessingDrawing" xmlns:wp="http://schemas.openxmlformats.org/drawingml/2006/wordprocessingDrawing" xmlns:wpg="http://schemas.microsoft.com/office/word/2010/wordprocessingGroup" xmlns:wpi="http://schemas.microsoft.com/office/word/2010/wordprocessingInk" xmlns:wps="http://schemas.microsoft.com/office/word/2010/wordprocessingShape" xmlns:o="urn:schemas-microsoft-com:office:office" xmlns:v="urn:schemas-microsoft-com:vml" xmlns:w10="urn:schemas-microsoft-com:office:word" xmlns:w="http://schemas.openxmlformats.org/wordprocessingml/2006/main" xmlns:w14="http://schemas.microsoft.com/office/word/2010/wordml" xmlns:w15="http://schemas.microsoft.com/office/word/2012/wordml" xmlns:w16cex="http://schemas.microsoft.com/office/word/2018/wordml/cex" xmlns:w16cid="http://schemas.microsoft.com/office/word/2016/wordml/cid" xmlns:w16="http://schemas.microsoft.com/office/word/2018/wordml" xmlns:w16sdtdh="http://schemas.microsoft.com/office/word/2020/wordml/sdtdatahash" xmlns:w16sdtfl="http://schemas.microsoft.com/office/word/2024/wordml/sdtformatlock" xmlns:w16se="http://schemas.microsoft.com/office/word/2015/wordml/symex" xmlns:w16du="http://schemas.microsoft.com/office/word/2023/wordml/word16du" xmlns:wne="http://schemas.microsoft.com/office/word/2006/wordml" mc:Ignorable="w14 w15 w16se w16cid w16 w16cex w16sdtdh w16sdtfl w16du wp14">
+<w:ftr xmlns:wpc="http://schemas.microsoft.com/office/word/2010/wordprocessingCanvas" xmlns:cx="http://schemas.microsoft.com/office/drawing/2014/chartex" xmlns:cx1="http://schemas.microsoft.com/office/drawing/2015/9/8/chartex" xmlns:cx2="http://schemas.microsoft.com/office/drawing/2015/10/21/chartex" xmlns:cx3="http://schemas.microsoft.com/office/drawing/2016/5/9/chartex" xmlns:cx4="http://schemas.microsoft.com/office/drawing/2016/5/10/chartex" xmlns:cx5="http://schemas.microsoft.com/office/drawing/2016/5/11/chartex" xmlns:cx6="http://schemas.microsoft.com/office/drawing/2016/5/12/chartex" xmlns:cx7="http://schemas.microsoft.com/office/drawing/2016/5/13/chartex" xmlns:cx8="http://schemas.microsoft.com/office/drawing/2016/5/14/chartex" xmlns:mc="http://schemas.openxmlformats.org/markup-compatibility/2006" xmlns:aink="http://schemas.microsoft.com/office/drawing/2016/ink" xmlns:am3d="http://schemas.microsoft.com/office/drawing/2017/model3d" xmlns:o="urn:schemas-microsoft-com:office:office" xmlns:oel="http://schemas.microsoft.com/office/2019/extlst" xmlns:r="http://schemas.openxmlformats.org/officeDocument/2006/relationships" xmlns:m="http://schemas.openxmlformats.org/officeDocument/2006/math" xmlns:v="urn:schemas-microsoft-com:vml" xmlns:wp14="http://schemas.microsoft.com/office/word/2010/wordprocessingDrawing" xmlns:wp="http://schemas.openxmlformats.org/drawingml/2006/wordprocessingDrawing" xmlns:w10="urn:schemas-microsoft-com:office:word" xmlns:w="http://schemas.openxmlformats.org/wordprocessingml/2006/main" xmlns:w14="http://schemas.microsoft.com/office/word/2010/wordml" xmlns:w15="http://schemas.microsoft.com/office/word/2012/wordml" xmlns:w16cex="http://schemas.microsoft.com/office/word/2018/wordml/cex" xmlns:w16cid="http://schemas.microsoft.com/office/word/2016/wordml/cid" xmlns:w16="http://schemas.microsoft.com/office/word/2018/wordml" xmlns:w16du="http://schemas.microsoft.com/office/word/2023/wordml/word16du" xmlns:w16sdtdh="http://schemas.microsoft.com/office/word/2020/wordml/sdtdatahash" xmlns:w16sdtfl="http://schemas.microsoft.com/office/word/2024/wordml/sdtformatlock" xmlns:w16se="http://schemas.microsoft.com/office/word/2015/wordml/symex" xmlns:wpg="http://schemas.microsoft.com/office/word/2010/wordprocessingGroup" xmlns:wpi="http://schemas.microsoft.com/office/word/2010/wordprocessingInk" xmlns:wne="http://schemas.microsoft.com/office/word/2006/wordml" xmlns:wps="http://schemas.microsoft.com/office/word/2010/wordprocessingShape" mc:Ignorable="w14 w15 w16se w16cid w16 w16cex w16sdtdh w16sdtfl w16du wp14">
   <w:p>
     <w:pPr>
-      <w:pStyle w:val="Footer"/>
-    </w:pPr>
-  </w:p>
-</w:ftr>
-</file>
-
-<file path=word/footer2.xml><?xml version="1.0" encoding="utf-8"?>
-<w:ftr xmlns:wpc="http://schemas.microsoft.com/office/word/2010/wordprocessingCanvas" xmlns:cx="http://schemas.microsoft.com/office/drawing/2014/chartex" xmlns:cx1="http://schemas.microsoft.com/office/drawing/2015/9/8/chartex" xmlns:cx2="http://schemas.microsoft.com/office/drawing/2015/10/21/chartex" xmlns:cx3="http://schemas.microsoft.com/office/drawing/2016/5/9/chartex" xmlns:cx4="http://schemas.microsoft.com/office/drawing/2016/5/10/chartex" xmlns:cx5="http://schemas.microsoft.com/office/drawing/2016/5/11/chartex" xmlns:cx6="http://schemas.microsoft.com/office/drawing/2016/5/12/chartex" xmlns:cx7="http://schemas.microsoft.com/office/drawing/2016/5/13/chartex" xmlns:cx8="http://schemas.microsoft.com/office/drawing/2016/5/14/chartex" xmlns:mc="http://schemas.openxmlformats.org/markup-compatibility/2006" xmlns:m="http://schemas.openxmlformats.org/officeDocument/2006/math" xmlns:aink="http://schemas.microsoft.com/office/drawing/2016/ink" xmlns:am3d="http://schemas.microsoft.com/office/drawing/2017/model3d" xmlns:oel="http://schemas.microsoft.com/office/2019/extlst" xmlns:r="http://schemas.openxmlformats.org/officeDocument/2006/relationships" xmlns:wp14="http://schemas.microsoft.com/office/word/2010/wordprocessingDrawing" xmlns:wp="http://schemas.openxmlformats.org/drawingml/2006/wordprocessingDrawing" xmlns:wpg="http://schemas.microsoft.com/office/word/2010/wordprocessingGroup" xmlns:wpi="http://schemas.microsoft.com/office/word/2010/wordprocessingInk" xmlns:wps="http://schemas.microsoft.com/office/word/2010/wordprocessingShape" xmlns:o="urn:schemas-microsoft-com:office:office" xmlns:v="urn:schemas-microsoft-com:vml" xmlns:w10="urn:schemas-microsoft-com:office:word" xmlns:w="http://schemas.openxmlformats.org/wordprocessingml/2006/main" xmlns:w14="http://schemas.microsoft.com/office/word/2010/wordml" xmlns:w15="http://schemas.microsoft.com/office/word/2012/wordml" xmlns:w16cex="http://schemas.microsoft.com/office/word/2018/wordml/cex" xmlns:w16cid="http://schemas.microsoft.com/office/word/2016/wordml/cid" xmlns:w16="http://schemas.microsoft.com/office/word/2018/wordml" xmlns:w16sdtdh="http://schemas.microsoft.com/office/word/2020/wordml/sdtdatahash" xmlns:w16sdtfl="http://schemas.microsoft.com/office/word/2024/wordml/sdtformatlock" xmlns:w16se="http://schemas.microsoft.com/office/word/2015/wordml/symex" xmlns:w16du="http://schemas.microsoft.com/office/word/2023/wordml/word16du" xmlns:wne="http://schemas.microsoft.com/office/word/2006/wordml" mc:Ignorable="w14 w15 w16se w16cid w16 w16cex w16sdtdh w16sdtfl w16du wp14">
-  <w:p>
-    <w:pPr>
-      <w:pStyle w:val="Footer"/>
+      <w:pStyle w:val="a7"/>
     </w:pPr>
     <w:r>
       <w:rPr>
@@ -1011,18 +1035,8 @@
 </w:ftr>
 </file>
 
-<file path=word/footer3.xml><?xml version="1.0" encoding="utf-8"?>
-<w:ftr xmlns:wpc="http://schemas.microsoft.com/office/word/2010/wordprocessingCanvas" xmlns:cx="http://schemas.microsoft.com/office/drawing/2014/chartex" xmlns:cx1="http://schemas.microsoft.com/office/drawing/2015/9/8/chartex" xmlns:cx2="http://schemas.microsoft.com/office/drawing/2015/10/21/chartex" xmlns:cx3="http://schemas.microsoft.com/office/drawing/2016/5/9/chartex" xmlns:cx4="http://schemas.microsoft.com/office/drawing/2016/5/10/chartex" xmlns:cx5="http://schemas.microsoft.com/office/drawing/2016/5/11/chartex" xmlns:cx6="http://schemas.microsoft.com/office/drawing/2016/5/12/chartex" xmlns:cx7="http://schemas.microsoft.com/office/drawing/2016/5/13/chartex" xmlns:cx8="http://schemas.microsoft.com/office/drawing/2016/5/14/chartex" xmlns:mc="http://schemas.openxmlformats.org/markup-compatibility/2006" xmlns:m="http://schemas.openxmlformats.org/officeDocument/2006/math" xmlns:aink="http://schemas.microsoft.com/office/drawing/2016/ink" xmlns:am3d="http://schemas.microsoft.com/office/drawing/2017/model3d" xmlns:oel="http://schemas.microsoft.com/office/2019/extlst" xmlns:r="http://schemas.openxmlformats.org/officeDocument/2006/relationships" xmlns:wp14="http://schemas.microsoft.com/office/word/2010/wordprocessingDrawing" xmlns:wp="http://schemas.openxmlformats.org/drawingml/2006/wordprocessingDrawing" xmlns:wpg="http://schemas.microsoft.com/office/word/2010/wordprocessingGroup" xmlns:wpi="http://schemas.microsoft.com/office/word/2010/wordprocessingInk" xmlns:wps="http://schemas.microsoft.com/office/word/2010/wordprocessingShape" xmlns:o="urn:schemas-microsoft-com:office:office" xmlns:v="urn:schemas-microsoft-com:vml" xmlns:w10="urn:schemas-microsoft-com:office:word" xmlns:w="http://schemas.openxmlformats.org/wordprocessingml/2006/main" xmlns:w14="http://schemas.microsoft.com/office/word/2010/wordml" xmlns:w15="http://schemas.microsoft.com/office/word/2012/wordml" xmlns:w16cex="http://schemas.microsoft.com/office/word/2018/wordml/cex" xmlns:w16cid="http://schemas.microsoft.com/office/word/2016/wordml/cid" xmlns:w16="http://schemas.microsoft.com/office/word/2018/wordml" xmlns:w16sdtdh="http://schemas.microsoft.com/office/word/2020/wordml/sdtdatahash" xmlns:w16sdtfl="http://schemas.microsoft.com/office/word/2024/wordml/sdtformatlock" xmlns:w16se="http://schemas.microsoft.com/office/word/2015/wordml/symex" xmlns:w16du="http://schemas.microsoft.com/office/word/2023/wordml/word16du" xmlns:wne="http://schemas.microsoft.com/office/word/2006/wordml" mc:Ignorable="w14 w15 w16se w16cid w16 w16cex w16sdtdh w16sdtfl w16du wp14">
-  <w:p>
-    <w:pPr>
-      <w:pStyle w:val="Footer"/>
-    </w:pPr>
-  </w:p>
-</w:ftr>
-</file>
-
 <file path=word/footnotes.xml><?xml version="1.0" encoding="utf-8"?>
-<w:footnotes xmlns:wpc="http://schemas.microsoft.com/office/word/2010/wordprocessingCanvas" xmlns:cx="http://schemas.microsoft.com/office/drawing/2014/chartex" xmlns:cx1="http://schemas.microsoft.com/office/drawing/2015/9/8/chartex" xmlns:cx2="http://schemas.microsoft.com/office/drawing/2015/10/21/chartex" xmlns:cx3="http://schemas.microsoft.com/office/drawing/2016/5/9/chartex" xmlns:cx4="http://schemas.microsoft.com/office/drawing/2016/5/10/chartex" xmlns:cx5="http://schemas.microsoft.com/office/drawing/2016/5/11/chartex" xmlns:cx6="http://schemas.microsoft.com/office/drawing/2016/5/12/chartex" xmlns:cx7="http://schemas.microsoft.com/office/drawing/2016/5/13/chartex" xmlns:cx8="http://schemas.microsoft.com/office/drawing/2016/5/14/chartex" xmlns:mc="http://schemas.openxmlformats.org/markup-compatibility/2006" xmlns:m="http://schemas.openxmlformats.org/officeDocument/2006/math" xmlns:aink="http://schemas.microsoft.com/office/drawing/2016/ink" xmlns:am3d="http://schemas.microsoft.com/office/drawing/2017/model3d" xmlns:oel="http://schemas.microsoft.com/office/2019/extlst" xmlns:r="http://schemas.openxmlformats.org/officeDocument/2006/relationships" xmlns:wp14="http://schemas.microsoft.com/office/word/2010/wordprocessingDrawing" xmlns:wp="http://schemas.openxmlformats.org/drawingml/2006/wordprocessingDrawing" xmlns:wpg="http://schemas.microsoft.com/office/word/2010/wordprocessingGroup" xmlns:wpi="http://schemas.microsoft.com/office/word/2010/wordprocessingInk" xmlns:wps="http://schemas.microsoft.com/office/word/2010/wordprocessingShape" xmlns:o="urn:schemas-microsoft-com:office:office" xmlns:v="urn:schemas-microsoft-com:vml" xmlns:w10="urn:schemas-microsoft-com:office:word" xmlns:w="http://schemas.openxmlformats.org/wordprocessingml/2006/main" xmlns:w14="http://schemas.microsoft.com/office/word/2010/wordml" xmlns:w15="http://schemas.microsoft.com/office/word/2012/wordml" xmlns:w16cex="http://schemas.microsoft.com/office/word/2018/wordml/cex" xmlns:w16cid="http://schemas.microsoft.com/office/word/2016/wordml/cid" xmlns:w16="http://schemas.microsoft.com/office/word/2018/wordml" xmlns:w16sdtdh="http://schemas.microsoft.com/office/word/2020/wordml/sdtdatahash" xmlns:w16sdtfl="http://schemas.microsoft.com/office/word/2024/wordml/sdtformatlock" xmlns:w16se="http://schemas.microsoft.com/office/word/2015/wordml/symex" xmlns:w16du="http://schemas.microsoft.com/office/word/2023/wordml/word16du" xmlns:wne="http://schemas.microsoft.com/office/word/2006/wordml" mc:Ignorable="w14 w15 w16se w16cid w16 w16cex w16sdtdh w16sdtfl w16du wp14">
+<w:footnotes xmlns:wpc="http://schemas.microsoft.com/office/word/2010/wordprocessingCanvas" xmlns:cx="http://schemas.microsoft.com/office/drawing/2014/chartex" xmlns:cx1="http://schemas.microsoft.com/office/drawing/2015/9/8/chartex" xmlns:cx2="http://schemas.microsoft.com/office/drawing/2015/10/21/chartex" xmlns:cx3="http://schemas.microsoft.com/office/drawing/2016/5/9/chartex" xmlns:cx4="http://schemas.microsoft.com/office/drawing/2016/5/10/chartex" xmlns:cx5="http://schemas.microsoft.com/office/drawing/2016/5/11/chartex" xmlns:cx6="http://schemas.microsoft.com/office/drawing/2016/5/12/chartex" xmlns:cx7="http://schemas.microsoft.com/office/drawing/2016/5/13/chartex" xmlns:cx8="http://schemas.microsoft.com/office/drawing/2016/5/14/chartex" xmlns:mc="http://schemas.openxmlformats.org/markup-compatibility/2006" xmlns:aink="http://schemas.microsoft.com/office/drawing/2016/ink" xmlns:am3d="http://schemas.microsoft.com/office/drawing/2017/model3d" xmlns:o="urn:schemas-microsoft-com:office:office" xmlns:oel="http://schemas.microsoft.com/office/2019/extlst" xmlns:r="http://schemas.openxmlformats.org/officeDocument/2006/relationships" xmlns:m="http://schemas.openxmlformats.org/officeDocument/2006/math" xmlns:v="urn:schemas-microsoft-com:vml" xmlns:wp14="http://schemas.microsoft.com/office/word/2010/wordprocessingDrawing" xmlns:wp="http://schemas.openxmlformats.org/drawingml/2006/wordprocessingDrawing" xmlns:w10="urn:schemas-microsoft-com:office:word" xmlns:w="http://schemas.openxmlformats.org/wordprocessingml/2006/main" xmlns:w14="http://schemas.microsoft.com/office/word/2010/wordml" xmlns:w15="http://schemas.microsoft.com/office/word/2012/wordml" xmlns:w16cex="http://schemas.microsoft.com/office/word/2018/wordml/cex" xmlns:w16cid="http://schemas.microsoft.com/office/word/2016/wordml/cid" xmlns:w16="http://schemas.microsoft.com/office/word/2018/wordml" xmlns:w16du="http://schemas.microsoft.com/office/word/2023/wordml/word16du" xmlns:w16sdtdh="http://schemas.microsoft.com/office/word/2020/wordml/sdtdatahash" xmlns:w16sdtfl="http://schemas.microsoft.com/office/word/2024/wordml/sdtformatlock" xmlns:w16se="http://schemas.microsoft.com/office/word/2015/wordml/symex" xmlns:wpg="http://schemas.microsoft.com/office/word/2010/wordprocessingGroup" xmlns:wpi="http://schemas.microsoft.com/office/word/2010/wordprocessingInk" xmlns:wne="http://schemas.microsoft.com/office/word/2006/wordml" xmlns:wps="http://schemas.microsoft.com/office/word/2010/wordprocessingShape" mc:Ignorable="w14 w15 w16se w16cid w16 w16cex w16sdtdh w16sdtfl w16du wp14">
   <w:footnote w:type="separator" w:id="-1">
     <w:p>
       <w:r>
@@ -1040,38 +1054,8 @@
 </w:footnotes>
 </file>
 
-<file path=word/header1.xml><?xml version="1.0" encoding="utf-8"?>
-<w:hdr xmlns:wpc="http://schemas.microsoft.com/office/word/2010/wordprocessingCanvas" xmlns:cx="http://schemas.microsoft.com/office/drawing/2014/chartex" xmlns:cx1="http://schemas.microsoft.com/office/drawing/2015/9/8/chartex" xmlns:cx2="http://schemas.microsoft.com/office/drawing/2015/10/21/chartex" xmlns:cx3="http://schemas.microsoft.com/office/drawing/2016/5/9/chartex" xmlns:cx4="http://schemas.microsoft.com/office/drawing/2016/5/10/chartex" xmlns:cx5="http://schemas.microsoft.com/office/drawing/2016/5/11/chartex" xmlns:cx6="http://schemas.microsoft.com/office/drawing/2016/5/12/chartex" xmlns:cx7="http://schemas.microsoft.com/office/drawing/2016/5/13/chartex" xmlns:cx8="http://schemas.microsoft.com/office/drawing/2016/5/14/chartex" xmlns:mc="http://schemas.openxmlformats.org/markup-compatibility/2006" xmlns:m="http://schemas.openxmlformats.org/officeDocument/2006/math" xmlns:aink="http://schemas.microsoft.com/office/drawing/2016/ink" xmlns:am3d="http://schemas.microsoft.com/office/drawing/2017/model3d" xmlns:oel="http://schemas.microsoft.com/office/2019/extlst" xmlns:r="http://schemas.openxmlformats.org/officeDocument/2006/relationships" xmlns:wp14="http://schemas.microsoft.com/office/word/2010/wordprocessingDrawing" xmlns:wp="http://schemas.openxmlformats.org/drawingml/2006/wordprocessingDrawing" xmlns:wpg="http://schemas.microsoft.com/office/word/2010/wordprocessingGroup" xmlns:wpi="http://schemas.microsoft.com/office/word/2010/wordprocessingInk" xmlns:wps="http://schemas.microsoft.com/office/word/2010/wordprocessingShape" xmlns:o="urn:schemas-microsoft-com:office:office" xmlns:v="urn:schemas-microsoft-com:vml" xmlns:w10="urn:schemas-microsoft-com:office:word" xmlns:w="http://schemas.openxmlformats.org/wordprocessingml/2006/main" xmlns:w14="http://schemas.microsoft.com/office/word/2010/wordml" xmlns:w15="http://schemas.microsoft.com/office/word/2012/wordml" xmlns:w16cex="http://schemas.microsoft.com/office/word/2018/wordml/cex" xmlns:w16cid="http://schemas.microsoft.com/office/word/2016/wordml/cid" xmlns:w16="http://schemas.microsoft.com/office/word/2018/wordml" xmlns:w16sdtdh="http://schemas.microsoft.com/office/word/2020/wordml/sdtdatahash" xmlns:w16sdtfl="http://schemas.microsoft.com/office/word/2024/wordml/sdtformatlock" xmlns:w16se="http://schemas.microsoft.com/office/word/2015/wordml/symex" xmlns:w16du="http://schemas.microsoft.com/office/word/2023/wordml/word16du" xmlns:wne="http://schemas.microsoft.com/office/word/2006/wordml" mc:Ignorable="w14 w15 w16se w16cid w16 w16cex w16sdtdh w16sdtfl w16du wp14">
-  <w:p>
-    <w:pPr>
-      <w:pStyle w:val="Header"/>
-    </w:pPr>
-  </w:p>
-</w:hdr>
-</file>
-
-<file path=word/header2.xml><?xml version="1.0" encoding="utf-8"?>
-<w:hdr xmlns:wpc="http://schemas.microsoft.com/office/word/2010/wordprocessingCanvas" xmlns:cx="http://schemas.microsoft.com/office/drawing/2014/chartex" xmlns:cx1="http://schemas.microsoft.com/office/drawing/2015/9/8/chartex" xmlns:cx2="http://schemas.microsoft.com/office/drawing/2015/10/21/chartex" xmlns:cx3="http://schemas.microsoft.com/office/drawing/2016/5/9/chartex" xmlns:cx4="http://schemas.microsoft.com/office/drawing/2016/5/10/chartex" xmlns:cx5="http://schemas.microsoft.com/office/drawing/2016/5/11/chartex" xmlns:cx6="http://schemas.microsoft.com/office/drawing/2016/5/12/chartex" xmlns:cx7="http://schemas.microsoft.com/office/drawing/2016/5/13/chartex" xmlns:cx8="http://schemas.microsoft.com/office/drawing/2016/5/14/chartex" xmlns:mc="http://schemas.openxmlformats.org/markup-compatibility/2006" xmlns:m="http://schemas.openxmlformats.org/officeDocument/2006/math" xmlns:aink="http://schemas.microsoft.com/office/drawing/2016/ink" xmlns:am3d="http://schemas.microsoft.com/office/drawing/2017/model3d" xmlns:oel="http://schemas.microsoft.com/office/2019/extlst" xmlns:r="http://schemas.openxmlformats.org/officeDocument/2006/relationships" xmlns:wp14="http://schemas.microsoft.com/office/word/2010/wordprocessingDrawing" xmlns:wp="http://schemas.openxmlformats.org/drawingml/2006/wordprocessingDrawing" xmlns:wpg="http://schemas.microsoft.com/office/word/2010/wordprocessingGroup" xmlns:wpi="http://schemas.microsoft.com/office/word/2010/wordprocessingInk" xmlns:wps="http://schemas.microsoft.com/office/word/2010/wordprocessingShape" xmlns:o="urn:schemas-microsoft-com:office:office" xmlns:v="urn:schemas-microsoft-com:vml" xmlns:w10="urn:schemas-microsoft-com:office:word" xmlns:w="http://schemas.openxmlformats.org/wordprocessingml/2006/main" xmlns:w14="http://schemas.microsoft.com/office/word/2010/wordml" xmlns:w15="http://schemas.microsoft.com/office/word/2012/wordml" xmlns:w16cex="http://schemas.microsoft.com/office/word/2018/wordml/cex" xmlns:w16cid="http://schemas.microsoft.com/office/word/2016/wordml/cid" xmlns:w16="http://schemas.microsoft.com/office/word/2018/wordml" xmlns:w16sdtdh="http://schemas.microsoft.com/office/word/2020/wordml/sdtdatahash" xmlns:w16sdtfl="http://schemas.microsoft.com/office/word/2024/wordml/sdtformatlock" xmlns:w16se="http://schemas.microsoft.com/office/word/2015/wordml/symex" xmlns:w16du="http://schemas.microsoft.com/office/word/2023/wordml/word16du" xmlns:wne="http://schemas.microsoft.com/office/word/2006/wordml" mc:Ignorable="w14 w15 w16se w16cid w16 w16cex w16sdtdh w16sdtfl w16du wp14">
-  <w:p>
-    <w:pPr>
-      <w:pStyle w:val="Header"/>
-    </w:pPr>
-  </w:p>
-</w:hdr>
-</file>
-
-<file path=word/header3.xml><?xml version="1.0" encoding="utf-8"?>
-<w:hdr xmlns:wpc="http://schemas.microsoft.com/office/word/2010/wordprocessingCanvas" xmlns:cx="http://schemas.microsoft.com/office/drawing/2014/chartex" xmlns:cx1="http://schemas.microsoft.com/office/drawing/2015/9/8/chartex" xmlns:cx2="http://schemas.microsoft.com/office/drawing/2015/10/21/chartex" xmlns:cx3="http://schemas.microsoft.com/office/drawing/2016/5/9/chartex" xmlns:cx4="http://schemas.microsoft.com/office/drawing/2016/5/10/chartex" xmlns:cx5="http://schemas.microsoft.com/office/drawing/2016/5/11/chartex" xmlns:cx6="http://schemas.microsoft.com/office/drawing/2016/5/12/chartex" xmlns:cx7="http://schemas.microsoft.com/office/drawing/2016/5/13/chartex" xmlns:cx8="http://schemas.microsoft.com/office/drawing/2016/5/14/chartex" xmlns:mc="http://schemas.openxmlformats.org/markup-compatibility/2006" xmlns:m="http://schemas.openxmlformats.org/officeDocument/2006/math" xmlns:aink="http://schemas.microsoft.com/office/drawing/2016/ink" xmlns:am3d="http://schemas.microsoft.com/office/drawing/2017/model3d" xmlns:oel="http://schemas.microsoft.com/office/2019/extlst" xmlns:r="http://schemas.openxmlformats.org/officeDocument/2006/relationships" xmlns:wp14="http://schemas.microsoft.com/office/word/2010/wordprocessingDrawing" xmlns:wp="http://schemas.openxmlformats.org/drawingml/2006/wordprocessingDrawing" xmlns:wpg="http://schemas.microsoft.com/office/word/2010/wordprocessingGroup" xmlns:wpi="http://schemas.microsoft.com/office/word/2010/wordprocessingInk" xmlns:wps="http://schemas.microsoft.com/office/word/2010/wordprocessingShape" xmlns:o="urn:schemas-microsoft-com:office:office" xmlns:v="urn:schemas-microsoft-com:vml" xmlns:w10="urn:schemas-microsoft-com:office:word" xmlns:w="http://schemas.openxmlformats.org/wordprocessingml/2006/main" xmlns:w14="http://schemas.microsoft.com/office/word/2010/wordml" xmlns:w15="http://schemas.microsoft.com/office/word/2012/wordml" xmlns:w16cex="http://schemas.microsoft.com/office/word/2018/wordml/cex" xmlns:w16cid="http://schemas.microsoft.com/office/word/2016/wordml/cid" xmlns:w16="http://schemas.microsoft.com/office/word/2018/wordml" xmlns:w16sdtdh="http://schemas.microsoft.com/office/word/2020/wordml/sdtdatahash" xmlns:w16sdtfl="http://schemas.microsoft.com/office/word/2024/wordml/sdtformatlock" xmlns:w16se="http://schemas.microsoft.com/office/word/2015/wordml/symex" xmlns:w16du="http://schemas.microsoft.com/office/word/2023/wordml/word16du" xmlns:wne="http://schemas.microsoft.com/office/word/2006/wordml" mc:Ignorable="w14 w15 w16se w16cid w16 w16cex w16sdtdh w16sdtfl w16du wp14">
-  <w:p>
-    <w:pPr>
-      <w:pStyle w:val="Header"/>
-    </w:pPr>
-  </w:p>
-</w:hdr>
-</file>
-
 <file path=word/numbering.xml><?xml version="1.0" encoding="utf-8"?>
-<w:numbering xmlns:wpc="http://schemas.microsoft.com/office/word/2010/wordprocessingCanvas" xmlns:cx="http://schemas.microsoft.com/office/drawing/2014/chartex" xmlns:cx1="http://schemas.microsoft.com/office/drawing/2015/9/8/chartex" xmlns:cx2="http://schemas.microsoft.com/office/drawing/2015/10/21/chartex" xmlns:cx3="http://schemas.microsoft.com/office/drawing/2016/5/9/chartex" xmlns:cx4="http://schemas.microsoft.com/office/drawing/2016/5/10/chartex" xmlns:cx5="http://schemas.microsoft.com/office/drawing/2016/5/11/chartex" xmlns:cx6="http://schemas.microsoft.com/office/drawing/2016/5/12/chartex" xmlns:cx7="http://schemas.microsoft.com/office/drawing/2016/5/13/chartex" xmlns:cx8="http://schemas.microsoft.com/office/drawing/2016/5/14/chartex" xmlns:mc="http://schemas.openxmlformats.org/markup-compatibility/2006" xmlns:m="http://schemas.openxmlformats.org/officeDocument/2006/math" xmlns:aink="http://schemas.microsoft.com/office/drawing/2016/ink" xmlns:am3d="http://schemas.microsoft.com/office/drawing/2017/model3d" xmlns:oel="http://schemas.microsoft.com/office/2019/extlst" xmlns:r="http://schemas.openxmlformats.org/officeDocument/2006/relationships" xmlns:wp14="http://schemas.microsoft.com/office/word/2010/wordprocessingDrawing" xmlns:wp="http://schemas.openxmlformats.org/drawingml/2006/wordprocessingDrawing" xmlns:wpg="http://schemas.microsoft.com/office/word/2010/wordprocessingGroup" xmlns:wpi="http://schemas.microsoft.com/office/word/2010/wordprocessingInk" xmlns:wps="http://schemas.microsoft.com/office/word/2010/wordprocessingShape" xmlns:o="urn:schemas-microsoft-com:office:office" xmlns:v="urn:schemas-microsoft-com:vml" xmlns:w10="urn:schemas-microsoft-com:office:word" xmlns:w="http://schemas.openxmlformats.org/wordprocessingml/2006/main" xmlns:w14="http://schemas.microsoft.com/office/word/2010/wordml" xmlns:w15="http://schemas.microsoft.com/office/word/2012/wordml" xmlns:w16cex="http://schemas.microsoft.com/office/word/2018/wordml/cex" xmlns:w16cid="http://schemas.microsoft.com/office/word/2016/wordml/cid" xmlns:w16="http://schemas.microsoft.com/office/word/2018/wordml" xmlns:w16sdtdh="http://schemas.microsoft.com/office/word/2020/wordml/sdtdatahash" xmlns:w16sdtfl="http://schemas.microsoft.com/office/word/2024/wordml/sdtformatlock" xmlns:w16se="http://schemas.microsoft.com/office/word/2015/wordml/symex" xmlns:w16du="http://schemas.microsoft.com/office/word/2023/wordml/word16du" xmlns:wne="http://schemas.microsoft.com/office/word/2006/wordml" mc:Ignorable="w14 w15 w16se w16cid w16 w16cex w16sdtdh w16sdtfl w16du wp14">
+<w:numbering xmlns:wpc="http://schemas.microsoft.com/office/word/2010/wordprocessingCanvas" xmlns:cx="http://schemas.microsoft.com/office/drawing/2014/chartex" xmlns:cx1="http://schemas.microsoft.com/office/drawing/2015/9/8/chartex" xmlns:cx2="http://schemas.microsoft.com/office/drawing/2015/10/21/chartex" xmlns:cx3="http://schemas.microsoft.com/office/drawing/2016/5/9/chartex" xmlns:cx4="http://schemas.microsoft.com/office/drawing/2016/5/10/chartex" xmlns:cx5="http://schemas.microsoft.com/office/drawing/2016/5/11/chartex" xmlns:cx6="http://schemas.microsoft.com/office/drawing/2016/5/12/chartex" xmlns:cx7="http://schemas.microsoft.com/office/drawing/2016/5/13/chartex" xmlns:cx8="http://schemas.microsoft.com/office/drawing/2016/5/14/chartex" xmlns:mc="http://schemas.openxmlformats.org/markup-compatibility/2006" xmlns:aink="http://schemas.microsoft.com/office/drawing/2016/ink" xmlns:am3d="http://schemas.microsoft.com/office/drawing/2017/model3d" xmlns:o="urn:schemas-microsoft-com:office:office" xmlns:oel="http://schemas.microsoft.com/office/2019/extlst" xmlns:r="http://schemas.openxmlformats.org/officeDocument/2006/relationships" xmlns:m="http://schemas.openxmlformats.org/officeDocument/2006/math" xmlns:v="urn:schemas-microsoft-com:vml" xmlns:wp14="http://schemas.microsoft.com/office/word/2010/wordprocessingDrawing" xmlns:wp="http://schemas.openxmlformats.org/drawingml/2006/wordprocessingDrawing" xmlns:w10="urn:schemas-microsoft-com:office:word" xmlns:w="http://schemas.openxmlformats.org/wordprocessingml/2006/main" xmlns:w14="http://schemas.microsoft.com/office/word/2010/wordml" xmlns:w15="http://schemas.microsoft.com/office/word/2012/wordml" xmlns:w16cex="http://schemas.microsoft.com/office/word/2018/wordml/cex" xmlns:w16cid="http://schemas.microsoft.com/office/word/2016/wordml/cid" xmlns:w16="http://schemas.microsoft.com/office/word/2018/wordml" xmlns:w16du="http://schemas.microsoft.com/office/word/2023/wordml/word16du" xmlns:w16sdtdh="http://schemas.microsoft.com/office/word/2020/wordml/sdtdatahash" xmlns:w16sdtfl="http://schemas.microsoft.com/office/word/2024/wordml/sdtformatlock" xmlns:w16se="http://schemas.microsoft.com/office/word/2015/wordml/symex" xmlns:wpg="http://schemas.microsoft.com/office/word/2010/wordprocessingGroup" xmlns:wpi="http://schemas.microsoft.com/office/word/2010/wordprocessingInk" xmlns:wne="http://schemas.microsoft.com/office/word/2006/wordml" xmlns:wps="http://schemas.microsoft.com/office/word/2010/wordprocessingShape" mc:Ignorable="w14 w15 w16se w16cid w16 w16cex w16sdtdh w16sdtfl w16du wp14">
   <w:abstractNum w:abstractNumId="0" w15:restartNumberingAfterBreak="0">
     <w:nsid w:val="69C337CB"/>
     <w:multiLevelType w:val="multilevel"/>
@@ -1079,7 +1063,7 @@
     <w:lvl w:ilvl="0">
       <w:start w:val="1"/>
       <w:numFmt w:val="none"/>
-      <w:pStyle w:val="Heading1"/>
+      <w:pStyle w:val="1"/>
       <w:suff w:val="nothing"/>
       <w:lvlText w:val=""/>
       <w:lvlJc w:val="left"/>
@@ -1093,7 +1077,7 @@
     <w:lvl w:ilvl="1">
       <w:start w:val="1"/>
       <w:numFmt w:val="none"/>
-      <w:pStyle w:val="Heading2"/>
+      <w:pStyle w:val="2"/>
       <w:suff w:val="nothing"/>
       <w:lvlText w:val=""/>
       <w:lvlJc w:val="left"/>
@@ -1203,11 +1187,11 @@
 </file>
 
 <file path=word/styles.xml><?xml version="1.0" encoding="utf-8"?>
-<w:styles xmlns:mc="http://schemas.openxmlformats.org/markup-compatibility/2006" xmlns:r="http://schemas.openxmlformats.org/officeDocument/2006/relationships" xmlns:w="http://schemas.openxmlformats.org/wordprocessingml/2006/main" xmlns:w14="http://schemas.microsoft.com/office/word/2010/wordml" xmlns:w15="http://schemas.microsoft.com/office/word/2012/wordml" xmlns:w16cex="http://schemas.microsoft.com/office/word/2018/wordml/cex" xmlns:w16cid="http://schemas.microsoft.com/office/word/2016/wordml/cid" xmlns:w16="http://schemas.microsoft.com/office/word/2018/wordml" xmlns:w16sdtdh="http://schemas.microsoft.com/office/word/2020/wordml/sdtdatahash" xmlns:w16sdtfl="http://schemas.microsoft.com/office/word/2024/wordml/sdtformatlock" xmlns:w16se="http://schemas.microsoft.com/office/word/2015/wordml/symex" xmlns:w16du="http://schemas.microsoft.com/office/word/2023/wordml/word16du" mc:Ignorable="w14 w15 w16se w16cid w16 w16cex w16sdtdh w16sdtfl w16du">
+<w:styles xmlns:mc="http://schemas.openxmlformats.org/markup-compatibility/2006" xmlns:r="http://schemas.openxmlformats.org/officeDocument/2006/relationships" xmlns:w="http://schemas.openxmlformats.org/wordprocessingml/2006/main" xmlns:w14="http://schemas.microsoft.com/office/word/2010/wordml" xmlns:w15="http://schemas.microsoft.com/office/word/2012/wordml" xmlns:w16cex="http://schemas.microsoft.com/office/word/2018/wordml/cex" xmlns:w16cid="http://schemas.microsoft.com/office/word/2016/wordml/cid" xmlns:w16="http://schemas.microsoft.com/office/word/2018/wordml" xmlns:w16du="http://schemas.microsoft.com/office/word/2023/wordml/word16du" xmlns:w16sdtdh="http://schemas.microsoft.com/office/word/2020/wordml/sdtdatahash" xmlns:w16sdtfl="http://schemas.microsoft.com/office/word/2024/wordml/sdtformatlock" xmlns:w16se="http://schemas.microsoft.com/office/word/2015/wordml/symex" mc:Ignorable="w14 w15 w16se w16cid w16 w16cex w16sdtdh w16sdtfl w16du">
   <w:docDefaults>
     <w:rPrDefault>
       <w:rPr>
-        <w:rFonts w:ascii="Liberation Serif" w:eastAsia="Noto Serif CJK SC" w:hAnsi="Liberation Serif" w:cs="Noto Sans Devanagari"/>
+        <w:rFonts w:ascii="Liberation Serif" w:eastAsia="宋体" w:hAnsi="Liberation Serif" w:cs="Noto Sans Devanagari"/>
         <w:szCs w:val="24"/>
         <w:lang w:val="en-US" w:eastAsia="zh-CN" w:bidi="hi-IN"/>
       </w:rPr>
@@ -1596,7 +1580,7 @@
     <w:lsdException w:name="Unresolved Mention" w:semiHidden="1" w:unhideWhenUsed="1"/>
     <w:lsdException w:name="Smart Link" w:semiHidden="1" w:unhideWhenUsed="1"/>
   </w:latentStyles>
-  <w:style w:type="paragraph" w:default="1" w:styleId="Normal">
+  <w:style w:type="paragraph" w:default="1" w:styleId="a">
     <w:name w:val="Normal"/>
     <w:qFormat/>
     <w:rPr>
@@ -1605,10 +1589,10 @@
       <w:lang w:bidi="ar-SA"/>
     </w:rPr>
   </w:style>
-  <w:style w:type="paragraph" w:styleId="Heading1">
+  <w:style w:type="paragraph" w:styleId="1">
     <w:name w:val="heading 1"/>
-    <w:basedOn w:val="Normal"/>
-    <w:next w:val="Normal"/>
+    <w:basedOn w:val="a"/>
+    <w:next w:val="a"/>
     <w:uiPriority w:val="9"/>
     <w:qFormat/>
     <w:pPr>
@@ -1624,10 +1608,10 @@
       <w:i/>
     </w:rPr>
   </w:style>
-  <w:style w:type="paragraph" w:styleId="Heading2">
+  <w:style w:type="paragraph" w:styleId="2">
     <w:name w:val="heading 2"/>
-    <w:basedOn w:val="Normal"/>
-    <w:next w:val="Normal"/>
+    <w:basedOn w:val="a"/>
+    <w:next w:val="a"/>
     <w:uiPriority w:val="9"/>
     <w:semiHidden/>
     <w:unhideWhenUsed/>
@@ -1645,12 +1629,12 @@
       <w:iCs/>
     </w:rPr>
   </w:style>
-  <w:style w:type="character" w:default="1" w:styleId="DefaultParagraphFont">
+  <w:style w:type="character" w:default="1" w:styleId="a0">
     <w:name w:val="Default Paragraph Font"/>
     <w:uiPriority w:val="1"/>
     <w:unhideWhenUsed/>
   </w:style>
-  <w:style w:type="table" w:default="1" w:styleId="TableNormal">
+  <w:style w:type="table" w:default="1" w:styleId="a1">
     <w:name w:val="Normal Table"/>
     <w:uiPriority w:val="99"/>
     <w:semiHidden/>
@@ -1665,7 +1649,7 @@
       </w:tblCellMar>
     </w:tblPr>
   </w:style>
-  <w:style w:type="numbering" w:default="1" w:styleId="NoList">
+  <w:style w:type="numbering" w:default="1" w:styleId="a2">
     <w:name w:val="No List"/>
     <w:uiPriority w:val="99"/>
     <w:semiHidden/>
@@ -1723,8 +1707,8 @@
   </w:style>
   <w:style w:type="paragraph" w:customStyle="1" w:styleId="Heading">
     <w:name w:val="Heading"/>
-    <w:basedOn w:val="Normal"/>
-    <w:next w:val="BodyText"/>
+    <w:basedOn w:val="a"/>
+    <w:next w:val="a3"/>
     <w:qFormat/>
     <w:pPr>
       <w:keepNext/>
@@ -1736,23 +1720,23 @@
       <w:szCs w:val="28"/>
     </w:rPr>
   </w:style>
-  <w:style w:type="paragraph" w:styleId="BodyText">
+  <w:style w:type="paragraph" w:styleId="a3">
     <w:name w:val="Body Text"/>
-    <w:basedOn w:val="Normal"/>
+    <w:basedOn w:val="a"/>
     <w:pPr>
       <w:spacing w:after="140" w:line="276" w:lineRule="auto"/>
     </w:pPr>
   </w:style>
-  <w:style w:type="paragraph" w:styleId="List">
+  <w:style w:type="paragraph" w:styleId="a4">
     <w:name w:val="List"/>
-    <w:basedOn w:val="BodyText"/>
+    <w:basedOn w:val="a3"/>
     <w:rPr>
       <w:rFonts w:cs="Noto Sans Devanagari"/>
     </w:rPr>
   </w:style>
-  <w:style w:type="paragraph" w:styleId="Caption">
+  <w:style w:type="paragraph" w:styleId="a5">
     <w:name w:val="caption"/>
-    <w:basedOn w:val="Normal"/>
+    <w:basedOn w:val="a"/>
     <w:qFormat/>
     <w:pPr>
       <w:suppressLineNumbers/>
@@ -1766,7 +1750,7 @@
   </w:style>
   <w:style w:type="paragraph" w:customStyle="1" w:styleId="Index">
     <w:name w:val="Index"/>
-    <w:basedOn w:val="Normal"/>
+    <w:basedOn w:val="a"/>
     <w:qFormat/>
     <w:pPr>
       <w:suppressLineNumbers/>
@@ -1777,7 +1761,7 @@
   </w:style>
   <w:style w:type="paragraph" w:customStyle="1" w:styleId="HeaderandFooter">
     <w:name w:val="Header and Footer"/>
-    <w:basedOn w:val="Normal"/>
+    <w:basedOn w:val="a"/>
     <w:qFormat/>
     <w:pPr>
       <w:suppressLineNumbers/>
@@ -1787,9 +1771,9 @@
       </w:tabs>
     </w:pPr>
   </w:style>
-  <w:style w:type="paragraph" w:styleId="Header">
+  <w:style w:type="paragraph" w:styleId="a6">
     <w:name w:val="header"/>
-    <w:basedOn w:val="Normal"/>
+    <w:basedOn w:val="a"/>
     <w:pPr>
       <w:tabs>
         <w:tab w:val="center" w:pos="4320"/>
@@ -1797,9 +1781,9 @@
       </w:tabs>
     </w:pPr>
   </w:style>
-  <w:style w:type="paragraph" w:styleId="Footer">
+  <w:style w:type="paragraph" w:styleId="a7">
     <w:name w:val="footer"/>
-    <w:basedOn w:val="Normal"/>
+    <w:basedOn w:val="a"/>
     <w:pPr>
       <w:tabs>
         <w:tab w:val="center" w:pos="4320"/>
@@ -1809,7 +1793,7 @@
   </w:style>
   <w:style w:type="paragraph" w:customStyle="1" w:styleId="TableContents">
     <w:name w:val="Table Contents"/>
-    <w:basedOn w:val="Normal"/>
+    <w:basedOn w:val="a"/>
     <w:qFormat/>
     <w:pPr>
       <w:suppressLineNumbers/>
@@ -1882,7 +1866,7 @@
     <a:fontScheme name="Office">
       <a:majorFont>
         <a:latin typeface="Aptos Display" panose="02110004020202020204"/>
-        <a:ea typeface=""/>
+        <a:ea typeface="黑体"/>
         <a:cs typeface=""/>
         <a:font script="Jpan" typeface="游ゴシック Light"/>
         <a:font script="Hang" typeface="맑은 고딕"/>
@@ -1934,7 +1918,7 @@
       </a:majorFont>
       <a:minorFont>
         <a:latin typeface="Aptos" panose="02110004020202020204"/>
-        <a:ea typeface=""/>
+        <a:ea typeface="宋体"/>
         <a:cs typeface=""/>
         <a:font script="Jpan" typeface="游明朝"/>
         <a:font script="Hang" typeface="맑은 고딕"/>

</xml_diff>

<commit_message>
Updates for amendment to ethics proposal
</commit_message>
<xml_diff>
--- a/StateOfPractice/MACREM-2026/SupportingDocuments/InterviewGuide.docx
+++ b/StateOfPractice/MACREM-2026/SupportingDocuments/InterviewGuide.docx
@@ -1,10 +1,10 @@
 
 <file path=word/document.xml><?xml version="1.0" encoding="utf-8"?>
-<w:document xmlns:wpc="http://schemas.microsoft.com/office/word/2010/wordprocessingCanvas" xmlns:cx="http://schemas.microsoft.com/office/drawing/2014/chartex" xmlns:cx1="http://schemas.microsoft.com/office/drawing/2015/9/8/chartex" xmlns:cx2="http://schemas.microsoft.com/office/drawing/2015/10/21/chartex" xmlns:cx3="http://schemas.microsoft.com/office/drawing/2016/5/9/chartex" xmlns:cx4="http://schemas.microsoft.com/office/drawing/2016/5/10/chartex" xmlns:cx5="http://schemas.microsoft.com/office/drawing/2016/5/11/chartex" xmlns:cx6="http://schemas.microsoft.com/office/drawing/2016/5/12/chartex" xmlns:cx7="http://schemas.microsoft.com/office/drawing/2016/5/13/chartex" xmlns:cx8="http://schemas.microsoft.com/office/drawing/2016/5/14/chartex" xmlns:mc="http://schemas.openxmlformats.org/markup-compatibility/2006" xmlns:aink="http://schemas.microsoft.com/office/drawing/2016/ink" xmlns:am3d="http://schemas.microsoft.com/office/drawing/2017/model3d" xmlns:o="urn:schemas-microsoft-com:office:office" xmlns:oel="http://schemas.microsoft.com/office/2019/extlst" xmlns:r="http://schemas.openxmlformats.org/officeDocument/2006/relationships" xmlns:m="http://schemas.openxmlformats.org/officeDocument/2006/math" xmlns:v="urn:schemas-microsoft-com:vml" xmlns:wp14="http://schemas.microsoft.com/office/word/2010/wordprocessingDrawing" xmlns:wp="http://schemas.openxmlformats.org/drawingml/2006/wordprocessingDrawing" xmlns:w10="urn:schemas-microsoft-com:office:word" xmlns:w="http://schemas.openxmlformats.org/wordprocessingml/2006/main" xmlns:w14="http://schemas.microsoft.com/office/word/2010/wordml" xmlns:w15="http://schemas.microsoft.com/office/word/2012/wordml" xmlns:w16cex="http://schemas.microsoft.com/office/word/2018/wordml/cex" xmlns:w16cid="http://schemas.microsoft.com/office/word/2016/wordml/cid" xmlns:w16="http://schemas.microsoft.com/office/word/2018/wordml" xmlns:w16du="http://schemas.microsoft.com/office/word/2023/wordml/word16du" xmlns:w16sdtdh="http://schemas.microsoft.com/office/word/2020/wordml/sdtdatahash" xmlns:w16sdtfl="http://schemas.microsoft.com/office/word/2024/wordml/sdtformatlock" xmlns:w16se="http://schemas.microsoft.com/office/word/2015/wordml/symex" xmlns:wpg="http://schemas.microsoft.com/office/word/2010/wordprocessingGroup" xmlns:wpi="http://schemas.microsoft.com/office/word/2010/wordprocessingInk" xmlns:wne="http://schemas.microsoft.com/office/word/2006/wordml" xmlns:wps="http://schemas.microsoft.com/office/word/2010/wordprocessingShape" mc:Ignorable="w14 w15 w16se w16cid w16 w16cex w16sdtdh w16sdtfl w16du wp14">
+<w:document xmlns:wpc="http://schemas.microsoft.com/office/word/2010/wordprocessingCanvas" xmlns:cx="http://schemas.microsoft.com/office/drawing/2014/chartex" xmlns:cx1="http://schemas.microsoft.com/office/drawing/2015/9/8/chartex" xmlns:cx2="http://schemas.microsoft.com/office/drawing/2015/10/21/chartex" xmlns:cx3="http://schemas.microsoft.com/office/drawing/2016/5/9/chartex" xmlns:cx4="http://schemas.microsoft.com/office/drawing/2016/5/10/chartex" xmlns:cx5="http://schemas.microsoft.com/office/drawing/2016/5/11/chartex" xmlns:cx6="http://schemas.microsoft.com/office/drawing/2016/5/12/chartex" xmlns:cx7="http://schemas.microsoft.com/office/drawing/2016/5/13/chartex" xmlns:cx8="http://schemas.microsoft.com/office/drawing/2016/5/14/chartex" xmlns:mc="http://schemas.openxmlformats.org/markup-compatibility/2006" xmlns:m="http://schemas.openxmlformats.org/officeDocument/2006/math" xmlns:aink="http://schemas.microsoft.com/office/drawing/2016/ink" xmlns:am3d="http://schemas.microsoft.com/office/drawing/2017/model3d" xmlns:oel="http://schemas.microsoft.com/office/2019/extlst" xmlns:r="http://schemas.openxmlformats.org/officeDocument/2006/relationships" xmlns:wp14="http://schemas.microsoft.com/office/word/2010/wordprocessingDrawing" xmlns:wp="http://schemas.openxmlformats.org/drawingml/2006/wordprocessingDrawing" xmlns:wpg="http://schemas.microsoft.com/office/word/2010/wordprocessingGroup" xmlns:wpi="http://schemas.microsoft.com/office/word/2010/wordprocessingInk" xmlns:wps="http://schemas.microsoft.com/office/word/2010/wordprocessingShape" xmlns:o="urn:schemas-microsoft-com:office:office" xmlns:v="urn:schemas-microsoft-com:vml" xmlns:w10="urn:schemas-microsoft-com:office:word" xmlns:w="http://schemas.openxmlformats.org/wordprocessingml/2006/main" xmlns:w14="http://schemas.microsoft.com/office/word/2010/wordml" xmlns:w15="http://schemas.microsoft.com/office/word/2012/wordml" xmlns:w16cei="http://schemas.microsoft.com/office/word/2026/wordml/cei" xmlns:w16cex="http://schemas.microsoft.com/office/word/2018/wordml/cex" xmlns:w16cid="http://schemas.microsoft.com/office/word/2016/wordml/cid" xmlns:w16="http://schemas.microsoft.com/office/word/2018/wordml" xmlns:w16sdtdh="http://schemas.microsoft.com/office/word/2020/wordml/sdtdatahash" xmlns:w16sdtfl="http://schemas.microsoft.com/office/word/2024/wordml/sdtformatlock" xmlns:w16se="http://schemas.microsoft.com/office/word/2015/wordml/symex" xmlns:w16du="http://schemas.microsoft.com/office/word/2023/wordml/word16du" xmlns:wne="http://schemas.microsoft.com/office/word/2006/wordml" mc:Ignorable="w14 w15 w16se w16cid w16 w16cex w16sdtdh w16sdtfl w16du wp14">
   <w:body>
     <w:p>
       <w:pPr>
-        <w:pStyle w:val="1"/>
+        <w:pStyle w:val="Heading1"/>
         <w:spacing w:line="240" w:lineRule="auto"/>
         <w:jc w:val="center"/>
         <w:rPr>
@@ -427,7 +427,7 @@
           <w:sz w:val="22"/>
           <w:szCs w:val="22"/>
         </w:rPr>
-        <w:t xml:space="preserve">it hard to ensure the correctness of the software? If there </w:t>
+        <w:t xml:space="preserve">it hard to ensure the correctness of the software? If there were any obstacles, what methods have been considered or practiced </w:t>
       </w:r>
       <w:proofErr w:type="gramStart"/>
       <w:r>
@@ -436,7 +436,7 @@
           <w:sz w:val="22"/>
           <w:szCs w:val="22"/>
         </w:rPr>
-        <w:t>were</w:t>
+        <w:t>to improve</w:t>
       </w:r>
       <w:proofErr w:type="gramEnd"/>
       <w:r>
@@ -445,24 +445,6 @@
           <w:sz w:val="22"/>
           <w:szCs w:val="22"/>
         </w:rPr>
-        <w:t xml:space="preserve"> any obstacles, what methods have been considered or practiced </w:t>
-      </w:r>
-      <w:proofErr w:type="gramStart"/>
-      <w:r>
-        <w:rPr>
-          <w:b/>
-          <w:sz w:val="22"/>
-          <w:szCs w:val="22"/>
-        </w:rPr>
-        <w:t>to improve</w:t>
-      </w:r>
-      <w:proofErr w:type="gramEnd"/>
-      <w:r>
-        <w:rPr>
-          <w:b/>
-          <w:sz w:val="22"/>
-          <w:szCs w:val="22"/>
-        </w:rPr>
         <w:t xml:space="preserve"> the situation? If practiced, did it work?</w:t>
       </w:r>
     </w:p>
@@ -587,254 +569,218 @@
           <w:sz w:val="22"/>
           <w:szCs w:val="22"/>
         </w:rPr>
-        <w:t xml:space="preserve">14. What positive contributions do LLM-based tools have </w:t>
-      </w:r>
-      <w:proofErr w:type="gramStart"/>
-      <w:r>
-        <w:rPr>
-          <w:b/>
-          <w:sz w:val="22"/>
-          <w:szCs w:val="22"/>
-        </w:rPr>
-        <w:t>on</w:t>
-      </w:r>
-      <w:proofErr w:type="gramEnd"/>
-      <w:r>
-        <w:rPr>
-          <w:b/>
-          <w:sz w:val="22"/>
-          <w:szCs w:val="22"/>
-        </w:rPr>
+        <w:t xml:space="preserve">14. What positive contributions do LLM-based tools have on </w:t>
+      </w:r>
+      <w:r>
+        <w:rPr>
+          <w:rFonts w:hint="eastAsia"/>
+          <w:b/>
+          <w:sz w:val="22"/>
+          <w:szCs w:val="22"/>
+        </w:rPr>
+        <w:t xml:space="preserve">the </w:t>
+      </w:r>
+      <w:r>
+        <w:rPr>
+          <w:b/>
+          <w:sz w:val="22"/>
+          <w:szCs w:val="22"/>
+        </w:rPr>
+        <w:t>development process</w:t>
+      </w:r>
+      <w:r>
+        <w:rPr>
+          <w:b/>
+          <w:sz w:val="22"/>
+          <w:szCs w:val="22"/>
+        </w:rPr>
+        <w:t>?</w:t>
+      </w:r>
+    </w:p>
+    <w:p>
+      <w:r>
+        <w:rPr>
+          <w:b/>
+          <w:sz w:val="22"/>
+          <w:szCs w:val="22"/>
+        </w:rPr>
+        <w:t>15. What negatives are associated with LLM-based tools?</w:t>
+      </w:r>
+    </w:p>
+    <w:p>
+      <w:pPr>
+        <w:rPr>
+          <w:b/>
+          <w:sz w:val="22"/>
+          <w:szCs w:val="22"/>
+        </w:rPr>
+      </w:pPr>
+    </w:p>
+    <w:p>
+      <w:pPr>
+        <w:rPr>
+          <w:b/>
+          <w:sz w:val="22"/>
+          <w:szCs w:val="22"/>
+        </w:rPr>
+      </w:pPr>
+      <w:r>
+        <w:rPr>
+          <w:b/>
+          <w:sz w:val="22"/>
+          <w:szCs w:val="22"/>
+        </w:rPr>
+        <w:t>Questions about Users</w:t>
+      </w:r>
+    </w:p>
+    <w:p>
+      <w:pPr>
+        <w:rPr>
+          <w:b/>
+          <w:sz w:val="22"/>
+          <w:szCs w:val="22"/>
+        </w:rPr>
+      </w:pPr>
+    </w:p>
+    <w:p>
+      <w:r>
+        <w:rPr>
+          <w:b/>
+          <w:sz w:val="22"/>
+          <w:szCs w:val="22"/>
+        </w:rPr>
+        <w:t>1</w:t>
+      </w:r>
+      <w:r>
+        <w:rPr>
+          <w:b/>
+          <w:sz w:val="22"/>
+          <w:szCs w:val="22"/>
+        </w:rPr>
+        <w:t>6</w:t>
+      </w:r>
+      <w:r>
+        <w:rPr>
+          <w:b/>
+          <w:sz w:val="22"/>
+          <w:szCs w:val="22"/>
+        </w:rPr>
+        <w:t>. What is the typical background of a user?</w:t>
+      </w:r>
+    </w:p>
+    <w:p>
+      <w:r>
+        <w:rPr>
+          <w:b/>
+          <w:sz w:val="22"/>
+          <w:szCs w:val="22"/>
+        </w:rPr>
+        <w:t>1</w:t>
+      </w:r>
+      <w:r>
+        <w:rPr>
+          <w:b/>
+          <w:sz w:val="22"/>
+          <w:szCs w:val="22"/>
+        </w:rPr>
+        <w:t>7</w:t>
+      </w:r>
+      <w:r>
+        <w:rPr>
+          <w:b/>
+          <w:sz w:val="22"/>
+          <w:szCs w:val="22"/>
+        </w:rPr>
+        <w:t xml:space="preserve">. Provide instances where users have misunderstood </w:t>
+      </w:r>
+      <w:r>
+        <w:rPr>
+          <w:b/>
+          <w:sz w:val="22"/>
+          <w:szCs w:val="22"/>
+        </w:rPr>
+        <w:t xml:space="preserve">or misused </w:t>
+      </w:r>
+      <w:r>
+        <w:rPr>
+          <w:b/>
+          <w:sz w:val="22"/>
+          <w:szCs w:val="22"/>
+        </w:rPr>
+        <w:t xml:space="preserve">the software. What, if any, actions were taken to address </w:t>
+      </w:r>
+      <w:r>
+        <w:rPr>
+          <w:b/>
+          <w:sz w:val="22"/>
+          <w:szCs w:val="22"/>
+        </w:rPr>
+        <w:t>usability</w:t>
+      </w:r>
+      <w:r>
+        <w:rPr>
+          <w:b/>
+          <w:sz w:val="22"/>
+          <w:szCs w:val="22"/>
+        </w:rPr>
+        <w:t xml:space="preserve"> issues?</w:t>
+      </w:r>
+    </w:p>
+    <w:p>
+      <w:pPr>
+        <w:rPr>
+          <w:rFonts w:eastAsia="DengXian"/>
+          <w:b/>
+          <w:sz w:val="22"/>
+          <w:szCs w:val="22"/>
+        </w:rPr>
+      </w:pPr>
+      <w:r>
+        <w:rPr>
+          <w:b/>
+          <w:sz w:val="22"/>
+          <w:szCs w:val="22"/>
+        </w:rPr>
+        <w:t>1</w:t>
+      </w:r>
+      <w:r>
+        <w:rPr>
+          <w:b/>
+          <w:sz w:val="22"/>
+          <w:szCs w:val="22"/>
+        </w:rPr>
+        <w:t>8</w:t>
+      </w:r>
+      <w:r>
+        <w:rPr>
+          <w:b/>
+          <w:sz w:val="22"/>
+          <w:szCs w:val="22"/>
+        </w:rPr>
+        <w:t>. Do you think the current documentation can clearly convey all necessary knowledge to the users? If yes, how did you successfully achieve it? If no, what improvements are needed?</w:t>
+      </w:r>
+    </w:p>
+    <w:p>
+      <w:pPr>
+        <w:rPr>
+          <w:rFonts w:eastAsia="DengXian"/>
+        </w:rPr>
+      </w:pPr>
+      <w:r>
+        <w:rPr>
+          <w:rFonts w:eastAsia="DengXian" w:hint="eastAsia"/>
+          <w:b/>
+          <w:sz w:val="22"/>
+          <w:szCs w:val="22"/>
+        </w:rPr>
+        <w:t>19.</w:t>
+      </w:r>
+      <w:r>
         <w:t xml:space="preserve"> </w:t>
       </w:r>
       <w:r>
         <w:rPr>
-          <w:rFonts w:hint="eastAsia"/>
-          <w:b/>
-          <w:sz w:val="22"/>
-          <w:szCs w:val="22"/>
-        </w:rPr>
-        <w:t xml:space="preserve">the </w:t>
-      </w:r>
-      <w:r>
-        <w:rPr>
-          <w:b/>
-          <w:sz w:val="22"/>
-          <w:szCs w:val="22"/>
-        </w:rPr>
-        <w:t>development process</w:t>
-      </w:r>
-      <w:r>
-        <w:rPr>
-          <w:b/>
-          <w:sz w:val="22"/>
-          <w:szCs w:val="22"/>
-        </w:rPr>
-        <w:t>?</w:t>
-      </w:r>
-    </w:p>
-    <w:p>
-      <w:r>
-        <w:rPr>
-          <w:b/>
-          <w:sz w:val="22"/>
-          <w:szCs w:val="22"/>
-        </w:rPr>
-        <w:t>15. What negatives are associated with LLM-based tools?</w:t>
-      </w:r>
-    </w:p>
-    <w:p>
-      <w:pPr>
-        <w:rPr>
-          <w:b/>
-          <w:sz w:val="22"/>
-          <w:szCs w:val="22"/>
-        </w:rPr>
-      </w:pPr>
-    </w:p>
-    <w:p>
-      <w:pPr>
-        <w:rPr>
-          <w:b/>
-          <w:sz w:val="22"/>
-          <w:szCs w:val="22"/>
-        </w:rPr>
-      </w:pPr>
-      <w:r>
-        <w:rPr>
-          <w:b/>
-          <w:sz w:val="22"/>
-          <w:szCs w:val="22"/>
-        </w:rPr>
-        <w:t>Questions about Users</w:t>
-      </w:r>
-    </w:p>
-    <w:p>
-      <w:pPr>
-        <w:rPr>
-          <w:b/>
-          <w:sz w:val="22"/>
-          <w:szCs w:val="22"/>
-        </w:rPr>
-      </w:pPr>
-    </w:p>
-    <w:p>
-      <w:r>
-        <w:rPr>
-          <w:b/>
-          <w:sz w:val="22"/>
-          <w:szCs w:val="22"/>
-        </w:rPr>
-        <w:t>1</w:t>
-      </w:r>
-      <w:r>
-        <w:rPr>
-          <w:b/>
-          <w:sz w:val="22"/>
-          <w:szCs w:val="22"/>
-        </w:rPr>
-        <w:t>6</w:t>
-      </w:r>
-      <w:r>
-        <w:rPr>
-          <w:b/>
-          <w:sz w:val="22"/>
-          <w:szCs w:val="22"/>
-        </w:rPr>
-        <w:t>. What is the typical background of a user?</w:t>
-      </w:r>
-    </w:p>
-    <w:p>
-      <w:r>
-        <w:rPr>
-          <w:b/>
-          <w:sz w:val="22"/>
-          <w:szCs w:val="22"/>
-        </w:rPr>
-        <w:t>1</w:t>
-      </w:r>
-      <w:r>
-        <w:rPr>
-          <w:b/>
-          <w:sz w:val="22"/>
-          <w:szCs w:val="22"/>
-        </w:rPr>
-        <w:t>7</w:t>
-      </w:r>
-      <w:r>
-        <w:rPr>
-          <w:b/>
-          <w:sz w:val="22"/>
-          <w:szCs w:val="22"/>
-        </w:rPr>
-        <w:t xml:space="preserve">. Provide instances where users have misunderstood </w:t>
-      </w:r>
-      <w:r>
-        <w:rPr>
-          <w:b/>
-          <w:sz w:val="22"/>
-          <w:szCs w:val="22"/>
-        </w:rPr>
-        <w:t xml:space="preserve">or misused </w:t>
-      </w:r>
-      <w:r>
-        <w:rPr>
-          <w:b/>
-          <w:sz w:val="22"/>
-          <w:szCs w:val="22"/>
-        </w:rPr>
-        <w:t xml:space="preserve">the software. What, if any, actions were taken to address </w:t>
-      </w:r>
-      <w:r>
-        <w:rPr>
-          <w:b/>
-          <w:sz w:val="22"/>
-          <w:szCs w:val="22"/>
-        </w:rPr>
-        <w:t>usability</w:t>
-      </w:r>
-      <w:r>
-        <w:rPr>
-          <w:b/>
-          <w:sz w:val="22"/>
-          <w:szCs w:val="22"/>
-        </w:rPr>
-        <w:t xml:space="preserve"> issues?</w:t>
-      </w:r>
-    </w:p>
-    <w:p>
-      <w:pPr>
-        <w:rPr>
-          <w:rFonts w:eastAsia="等线"/>
-          <w:b/>
-          <w:sz w:val="22"/>
-          <w:szCs w:val="22"/>
-        </w:rPr>
-      </w:pPr>
-      <w:r>
-        <w:rPr>
-          <w:b/>
-          <w:sz w:val="22"/>
-          <w:szCs w:val="22"/>
-        </w:rPr>
-        <w:t>1</w:t>
-      </w:r>
-      <w:r>
-        <w:rPr>
-          <w:b/>
-          <w:sz w:val="22"/>
-          <w:szCs w:val="22"/>
-        </w:rPr>
-        <w:t>8</w:t>
-      </w:r>
-      <w:r>
-        <w:rPr>
-          <w:b/>
-          <w:sz w:val="22"/>
-          <w:szCs w:val="22"/>
-        </w:rPr>
-        <w:t xml:space="preserve">. Do you think the current documentation can clearly convey all necessary knowledge to the users? If yes, how did you successfully achieve it? If </w:t>
-      </w:r>
-      <w:proofErr w:type="gramStart"/>
-      <w:r>
-        <w:rPr>
-          <w:b/>
-          <w:sz w:val="22"/>
-          <w:szCs w:val="22"/>
-        </w:rPr>
-        <w:t>no</w:t>
-      </w:r>
-      <w:proofErr w:type="gramEnd"/>
-      <w:r>
-        <w:rPr>
-          <w:b/>
-          <w:sz w:val="22"/>
-          <w:szCs w:val="22"/>
-        </w:rPr>
-        <w:t>, what improvements are needed?</w:t>
-      </w:r>
-    </w:p>
-    <w:p>
-      <w:pPr>
-        <w:rPr>
-          <w:rFonts w:eastAsia="等线"/>
-        </w:rPr>
-      </w:pPr>
-      <w:r>
-        <w:rPr>
-          <w:rFonts w:eastAsia="等线" w:hint="eastAsia"/>
-          <w:b/>
-          <w:sz w:val="22"/>
-          <w:szCs w:val="22"/>
-        </w:rPr>
-        <w:t>19.</w:t>
-      </w:r>
-      <w:r>
-        <w:t xml:space="preserve"> </w:t>
-      </w:r>
-      <w:r>
-        <w:rPr>
-          <w:rFonts w:eastAsia="等线"/>
+          <w:rFonts w:eastAsia="DengXian"/>
           <w:b/>
           <w:sz w:val="22"/>
           <w:szCs w:val="22"/>
@@ -843,7 +789,7 @@
       </w:r>
       <w:r>
         <w:rPr>
-          <w:rFonts w:eastAsia="等线"/>
+          <w:rFonts w:eastAsia="DengXian"/>
           <w:b/>
           <w:sz w:val="22"/>
           <w:szCs w:val="22"/>
@@ -852,7 +798,7 @@
       </w:r>
       <w:r>
         <w:rPr>
-          <w:rFonts w:eastAsia="等线" w:hint="eastAsia"/>
+          <w:rFonts w:eastAsia="DengXian" w:hint="eastAsia"/>
           <w:b/>
           <w:sz w:val="22"/>
           <w:szCs w:val="22"/>
@@ -861,7 +807,7 @@
       </w:r>
       <w:r>
         <w:rPr>
-          <w:rFonts w:eastAsia="等线"/>
+          <w:rFonts w:eastAsia="DengXian"/>
           <w:b/>
           <w:sz w:val="22"/>
           <w:szCs w:val="22"/>
@@ -873,7 +819,7 @@
       <w:pPr>
         <w:jc w:val="center"/>
         <w:rPr>
-          <w:rFonts w:eastAsia="等线" w:hint="eastAsia"/>
+          <w:rFonts w:eastAsia="DengXian"/>
           <w:b/>
           <w:sz w:val="18"/>
           <w:szCs w:val="18"/>
@@ -901,7 +847,7 @@
 </file>
 
 <file path=word/endnotes.xml><?xml version="1.0" encoding="utf-8"?>
-<w:endnotes xmlns:wpc="http://schemas.microsoft.com/office/word/2010/wordprocessingCanvas" xmlns:cx="http://schemas.microsoft.com/office/drawing/2014/chartex" xmlns:cx1="http://schemas.microsoft.com/office/drawing/2015/9/8/chartex" xmlns:cx2="http://schemas.microsoft.com/office/drawing/2015/10/21/chartex" xmlns:cx3="http://schemas.microsoft.com/office/drawing/2016/5/9/chartex" xmlns:cx4="http://schemas.microsoft.com/office/drawing/2016/5/10/chartex" xmlns:cx5="http://schemas.microsoft.com/office/drawing/2016/5/11/chartex" xmlns:cx6="http://schemas.microsoft.com/office/drawing/2016/5/12/chartex" xmlns:cx7="http://schemas.microsoft.com/office/drawing/2016/5/13/chartex" xmlns:cx8="http://schemas.microsoft.com/office/drawing/2016/5/14/chartex" xmlns:mc="http://schemas.openxmlformats.org/markup-compatibility/2006" xmlns:aink="http://schemas.microsoft.com/office/drawing/2016/ink" xmlns:am3d="http://schemas.microsoft.com/office/drawing/2017/model3d" xmlns:o="urn:schemas-microsoft-com:office:office" xmlns:oel="http://schemas.microsoft.com/office/2019/extlst" xmlns:r="http://schemas.openxmlformats.org/officeDocument/2006/relationships" xmlns:m="http://schemas.openxmlformats.org/officeDocument/2006/math" xmlns:v="urn:schemas-microsoft-com:vml" xmlns:wp14="http://schemas.microsoft.com/office/word/2010/wordprocessingDrawing" xmlns:wp="http://schemas.openxmlformats.org/drawingml/2006/wordprocessingDrawing" xmlns:w10="urn:schemas-microsoft-com:office:word" xmlns:w="http://schemas.openxmlformats.org/wordprocessingml/2006/main" xmlns:w14="http://schemas.microsoft.com/office/word/2010/wordml" xmlns:w15="http://schemas.microsoft.com/office/word/2012/wordml" xmlns:w16cex="http://schemas.microsoft.com/office/word/2018/wordml/cex" xmlns:w16cid="http://schemas.microsoft.com/office/word/2016/wordml/cid" xmlns:w16="http://schemas.microsoft.com/office/word/2018/wordml" xmlns:w16du="http://schemas.microsoft.com/office/word/2023/wordml/word16du" xmlns:w16sdtdh="http://schemas.microsoft.com/office/word/2020/wordml/sdtdatahash" xmlns:w16sdtfl="http://schemas.microsoft.com/office/word/2024/wordml/sdtformatlock" xmlns:w16se="http://schemas.microsoft.com/office/word/2015/wordml/symex" xmlns:wpg="http://schemas.microsoft.com/office/word/2010/wordprocessingGroup" xmlns:wpi="http://schemas.microsoft.com/office/word/2010/wordprocessingInk" xmlns:wne="http://schemas.microsoft.com/office/word/2006/wordml" xmlns:wps="http://schemas.microsoft.com/office/word/2010/wordprocessingShape" mc:Ignorable="w14 w15 w16se w16cid w16 w16cex w16sdtdh w16sdtfl w16du wp14">
+<w:endnotes xmlns:wpc="http://schemas.microsoft.com/office/word/2010/wordprocessingCanvas" xmlns:cx="http://schemas.microsoft.com/office/drawing/2014/chartex" xmlns:cx1="http://schemas.microsoft.com/office/drawing/2015/9/8/chartex" xmlns:cx2="http://schemas.microsoft.com/office/drawing/2015/10/21/chartex" xmlns:cx3="http://schemas.microsoft.com/office/drawing/2016/5/9/chartex" xmlns:cx4="http://schemas.microsoft.com/office/drawing/2016/5/10/chartex" xmlns:cx5="http://schemas.microsoft.com/office/drawing/2016/5/11/chartex" xmlns:cx6="http://schemas.microsoft.com/office/drawing/2016/5/12/chartex" xmlns:cx7="http://schemas.microsoft.com/office/drawing/2016/5/13/chartex" xmlns:cx8="http://schemas.microsoft.com/office/drawing/2016/5/14/chartex" xmlns:mc="http://schemas.openxmlformats.org/markup-compatibility/2006" xmlns:m="http://schemas.openxmlformats.org/officeDocument/2006/math" xmlns:aink="http://schemas.microsoft.com/office/drawing/2016/ink" xmlns:am3d="http://schemas.microsoft.com/office/drawing/2017/model3d" xmlns:oel="http://schemas.microsoft.com/office/2019/extlst" xmlns:r="http://schemas.openxmlformats.org/officeDocument/2006/relationships" xmlns:wp14="http://schemas.microsoft.com/office/word/2010/wordprocessingDrawing" xmlns:wp="http://schemas.openxmlformats.org/drawingml/2006/wordprocessingDrawing" xmlns:wpg="http://schemas.microsoft.com/office/word/2010/wordprocessingGroup" xmlns:wpi="http://schemas.microsoft.com/office/word/2010/wordprocessingInk" xmlns:wps="http://schemas.microsoft.com/office/word/2010/wordprocessingShape" xmlns:o="urn:schemas-microsoft-com:office:office" xmlns:v="urn:schemas-microsoft-com:vml" xmlns:w10="urn:schemas-microsoft-com:office:word" xmlns:w="http://schemas.openxmlformats.org/wordprocessingml/2006/main" xmlns:w14="http://schemas.microsoft.com/office/word/2010/wordml" xmlns:w15="http://schemas.microsoft.com/office/word/2012/wordml" xmlns:w16cei="http://schemas.microsoft.com/office/word/2026/wordml/cei" xmlns:w16cex="http://schemas.microsoft.com/office/word/2018/wordml/cex" xmlns:w16cid="http://schemas.microsoft.com/office/word/2016/wordml/cid" xmlns:w16="http://schemas.microsoft.com/office/word/2018/wordml" xmlns:w16sdtdh="http://schemas.microsoft.com/office/word/2020/wordml/sdtdatahash" xmlns:w16sdtfl="http://schemas.microsoft.com/office/word/2024/wordml/sdtformatlock" xmlns:w16se="http://schemas.microsoft.com/office/word/2015/wordml/symex" xmlns:w16du="http://schemas.microsoft.com/office/word/2023/wordml/word16du" xmlns:wne="http://schemas.microsoft.com/office/word/2006/wordml" mc:Ignorable="w14 w15 w16se w16cid w16 w16cex w16sdtdh w16sdtfl w16du wp14">
   <w:endnote w:type="separator" w:id="-1">
     <w:p>
       <w:r>
@@ -920,10 +866,10 @@
 </file>
 
 <file path=word/footer1.xml><?xml version="1.0" encoding="utf-8"?>
-<w:ftr xmlns:wpc="http://schemas.microsoft.com/office/word/2010/wordprocessingCanvas" xmlns:cx="http://schemas.microsoft.com/office/drawing/2014/chartex" xmlns:cx1="http://schemas.microsoft.com/office/drawing/2015/9/8/chartex" xmlns:cx2="http://schemas.microsoft.com/office/drawing/2015/10/21/chartex" xmlns:cx3="http://schemas.microsoft.com/office/drawing/2016/5/9/chartex" xmlns:cx4="http://schemas.microsoft.com/office/drawing/2016/5/10/chartex" xmlns:cx5="http://schemas.microsoft.com/office/drawing/2016/5/11/chartex" xmlns:cx6="http://schemas.microsoft.com/office/drawing/2016/5/12/chartex" xmlns:cx7="http://schemas.microsoft.com/office/drawing/2016/5/13/chartex" xmlns:cx8="http://schemas.microsoft.com/office/drawing/2016/5/14/chartex" xmlns:mc="http://schemas.openxmlformats.org/markup-compatibility/2006" xmlns:aink="http://schemas.microsoft.com/office/drawing/2016/ink" xmlns:am3d="http://schemas.microsoft.com/office/drawing/2017/model3d" xmlns:o="urn:schemas-microsoft-com:office:office" xmlns:oel="http://schemas.microsoft.com/office/2019/extlst" xmlns:r="http://schemas.openxmlformats.org/officeDocument/2006/relationships" xmlns:m="http://schemas.openxmlformats.org/officeDocument/2006/math" xmlns:v="urn:schemas-microsoft-com:vml" xmlns:wp14="http://schemas.microsoft.com/office/word/2010/wordprocessingDrawing" xmlns:wp="http://schemas.openxmlformats.org/drawingml/2006/wordprocessingDrawing" xmlns:w10="urn:schemas-microsoft-com:office:word" xmlns:w="http://schemas.openxmlformats.org/wordprocessingml/2006/main" xmlns:w14="http://schemas.microsoft.com/office/word/2010/wordml" xmlns:w15="http://schemas.microsoft.com/office/word/2012/wordml" xmlns:w16cex="http://schemas.microsoft.com/office/word/2018/wordml/cex" xmlns:w16cid="http://schemas.microsoft.com/office/word/2016/wordml/cid" xmlns:w16="http://schemas.microsoft.com/office/word/2018/wordml" xmlns:w16du="http://schemas.microsoft.com/office/word/2023/wordml/word16du" xmlns:w16sdtdh="http://schemas.microsoft.com/office/word/2020/wordml/sdtdatahash" xmlns:w16sdtfl="http://schemas.microsoft.com/office/word/2024/wordml/sdtformatlock" xmlns:w16se="http://schemas.microsoft.com/office/word/2015/wordml/symex" xmlns:wpg="http://schemas.microsoft.com/office/word/2010/wordprocessingGroup" xmlns:wpi="http://schemas.microsoft.com/office/word/2010/wordprocessingInk" xmlns:wne="http://schemas.microsoft.com/office/word/2006/wordml" xmlns:wps="http://schemas.microsoft.com/office/word/2010/wordprocessingShape" mc:Ignorable="w14 w15 w16se w16cid w16 w16cex w16sdtdh w16sdtfl w16du wp14">
+<w:ftr xmlns:wpc="http://schemas.microsoft.com/office/word/2010/wordprocessingCanvas" xmlns:cx="http://schemas.microsoft.com/office/drawing/2014/chartex" xmlns:cx1="http://schemas.microsoft.com/office/drawing/2015/9/8/chartex" xmlns:cx2="http://schemas.microsoft.com/office/drawing/2015/10/21/chartex" xmlns:cx3="http://schemas.microsoft.com/office/drawing/2016/5/9/chartex" xmlns:cx4="http://schemas.microsoft.com/office/drawing/2016/5/10/chartex" xmlns:cx5="http://schemas.microsoft.com/office/drawing/2016/5/11/chartex" xmlns:cx6="http://schemas.microsoft.com/office/drawing/2016/5/12/chartex" xmlns:cx7="http://schemas.microsoft.com/office/drawing/2016/5/13/chartex" xmlns:cx8="http://schemas.microsoft.com/office/drawing/2016/5/14/chartex" xmlns:mc="http://schemas.openxmlformats.org/markup-compatibility/2006" xmlns:m="http://schemas.openxmlformats.org/officeDocument/2006/math" xmlns:aink="http://schemas.microsoft.com/office/drawing/2016/ink" xmlns:am3d="http://schemas.microsoft.com/office/drawing/2017/model3d" xmlns:oel="http://schemas.microsoft.com/office/2019/extlst" xmlns:r="http://schemas.openxmlformats.org/officeDocument/2006/relationships" xmlns:wp14="http://schemas.microsoft.com/office/word/2010/wordprocessingDrawing" xmlns:wp="http://schemas.openxmlformats.org/drawingml/2006/wordprocessingDrawing" xmlns:wpg="http://schemas.microsoft.com/office/word/2010/wordprocessingGroup" xmlns:wpi="http://schemas.microsoft.com/office/word/2010/wordprocessingInk" xmlns:wps="http://schemas.microsoft.com/office/word/2010/wordprocessingShape" xmlns:o="urn:schemas-microsoft-com:office:office" xmlns:v="urn:schemas-microsoft-com:vml" xmlns:w10="urn:schemas-microsoft-com:office:word" xmlns:w="http://schemas.openxmlformats.org/wordprocessingml/2006/main" xmlns:w14="http://schemas.microsoft.com/office/word/2010/wordml" xmlns:w15="http://schemas.microsoft.com/office/word/2012/wordml" xmlns:w16cei="http://schemas.microsoft.com/office/word/2026/wordml/cei" xmlns:w16cex="http://schemas.microsoft.com/office/word/2018/wordml/cex" xmlns:w16cid="http://schemas.microsoft.com/office/word/2016/wordml/cid" xmlns:w16="http://schemas.microsoft.com/office/word/2018/wordml" xmlns:w16sdtdh="http://schemas.microsoft.com/office/word/2020/wordml/sdtdatahash" xmlns:w16sdtfl="http://schemas.microsoft.com/office/word/2024/wordml/sdtformatlock" xmlns:w16se="http://schemas.microsoft.com/office/word/2015/wordml/symex" xmlns:w16du="http://schemas.microsoft.com/office/word/2023/wordml/word16du" xmlns:wne="http://schemas.microsoft.com/office/word/2006/wordml" mc:Ignorable="w14 w15 w16se w16cid w16 w16cex w16sdtdh w16sdtfl w16du wp14">
   <w:p>
     <w:pPr>
-      <w:pStyle w:val="a7"/>
+      <w:pStyle w:val="Footer"/>
     </w:pPr>
     <w:r>
       <w:rPr>
@@ -1036,7 +982,7 @@
 </file>
 
 <file path=word/footnotes.xml><?xml version="1.0" encoding="utf-8"?>
-<w:footnotes xmlns:wpc="http://schemas.microsoft.com/office/word/2010/wordprocessingCanvas" xmlns:cx="http://schemas.microsoft.com/office/drawing/2014/chartex" xmlns:cx1="http://schemas.microsoft.com/office/drawing/2015/9/8/chartex" xmlns:cx2="http://schemas.microsoft.com/office/drawing/2015/10/21/chartex" xmlns:cx3="http://schemas.microsoft.com/office/drawing/2016/5/9/chartex" xmlns:cx4="http://schemas.microsoft.com/office/drawing/2016/5/10/chartex" xmlns:cx5="http://schemas.microsoft.com/office/drawing/2016/5/11/chartex" xmlns:cx6="http://schemas.microsoft.com/office/drawing/2016/5/12/chartex" xmlns:cx7="http://schemas.microsoft.com/office/drawing/2016/5/13/chartex" xmlns:cx8="http://schemas.microsoft.com/office/drawing/2016/5/14/chartex" xmlns:mc="http://schemas.openxmlformats.org/markup-compatibility/2006" xmlns:aink="http://schemas.microsoft.com/office/drawing/2016/ink" xmlns:am3d="http://schemas.microsoft.com/office/drawing/2017/model3d" xmlns:o="urn:schemas-microsoft-com:office:office" xmlns:oel="http://schemas.microsoft.com/office/2019/extlst" xmlns:r="http://schemas.openxmlformats.org/officeDocument/2006/relationships" xmlns:m="http://schemas.openxmlformats.org/officeDocument/2006/math" xmlns:v="urn:schemas-microsoft-com:vml" xmlns:wp14="http://schemas.microsoft.com/office/word/2010/wordprocessingDrawing" xmlns:wp="http://schemas.openxmlformats.org/drawingml/2006/wordprocessingDrawing" xmlns:w10="urn:schemas-microsoft-com:office:word" xmlns:w="http://schemas.openxmlformats.org/wordprocessingml/2006/main" xmlns:w14="http://schemas.microsoft.com/office/word/2010/wordml" xmlns:w15="http://schemas.microsoft.com/office/word/2012/wordml" xmlns:w16cex="http://schemas.microsoft.com/office/word/2018/wordml/cex" xmlns:w16cid="http://schemas.microsoft.com/office/word/2016/wordml/cid" xmlns:w16="http://schemas.microsoft.com/office/word/2018/wordml" xmlns:w16du="http://schemas.microsoft.com/office/word/2023/wordml/word16du" xmlns:w16sdtdh="http://schemas.microsoft.com/office/word/2020/wordml/sdtdatahash" xmlns:w16sdtfl="http://schemas.microsoft.com/office/word/2024/wordml/sdtformatlock" xmlns:w16se="http://schemas.microsoft.com/office/word/2015/wordml/symex" xmlns:wpg="http://schemas.microsoft.com/office/word/2010/wordprocessingGroup" xmlns:wpi="http://schemas.microsoft.com/office/word/2010/wordprocessingInk" xmlns:wne="http://schemas.microsoft.com/office/word/2006/wordml" xmlns:wps="http://schemas.microsoft.com/office/word/2010/wordprocessingShape" mc:Ignorable="w14 w15 w16se w16cid w16 w16cex w16sdtdh w16sdtfl w16du wp14">
+<w:footnotes xmlns:wpc="http://schemas.microsoft.com/office/word/2010/wordprocessingCanvas" xmlns:cx="http://schemas.microsoft.com/office/drawing/2014/chartex" xmlns:cx1="http://schemas.microsoft.com/office/drawing/2015/9/8/chartex" xmlns:cx2="http://schemas.microsoft.com/office/drawing/2015/10/21/chartex" xmlns:cx3="http://schemas.microsoft.com/office/drawing/2016/5/9/chartex" xmlns:cx4="http://schemas.microsoft.com/office/drawing/2016/5/10/chartex" xmlns:cx5="http://schemas.microsoft.com/office/drawing/2016/5/11/chartex" xmlns:cx6="http://schemas.microsoft.com/office/drawing/2016/5/12/chartex" xmlns:cx7="http://schemas.microsoft.com/office/drawing/2016/5/13/chartex" xmlns:cx8="http://schemas.microsoft.com/office/drawing/2016/5/14/chartex" xmlns:mc="http://schemas.openxmlformats.org/markup-compatibility/2006" xmlns:m="http://schemas.openxmlformats.org/officeDocument/2006/math" xmlns:aink="http://schemas.microsoft.com/office/drawing/2016/ink" xmlns:am3d="http://schemas.microsoft.com/office/drawing/2017/model3d" xmlns:oel="http://schemas.microsoft.com/office/2019/extlst" xmlns:r="http://schemas.openxmlformats.org/officeDocument/2006/relationships" xmlns:wp14="http://schemas.microsoft.com/office/word/2010/wordprocessingDrawing" xmlns:wp="http://schemas.openxmlformats.org/drawingml/2006/wordprocessingDrawing" xmlns:wpg="http://schemas.microsoft.com/office/word/2010/wordprocessingGroup" xmlns:wpi="http://schemas.microsoft.com/office/word/2010/wordprocessingInk" xmlns:wps="http://schemas.microsoft.com/office/word/2010/wordprocessingShape" xmlns:o="urn:schemas-microsoft-com:office:office" xmlns:v="urn:schemas-microsoft-com:vml" xmlns:w10="urn:schemas-microsoft-com:office:word" xmlns:w="http://schemas.openxmlformats.org/wordprocessingml/2006/main" xmlns:w14="http://schemas.microsoft.com/office/word/2010/wordml" xmlns:w15="http://schemas.microsoft.com/office/word/2012/wordml" xmlns:w16cei="http://schemas.microsoft.com/office/word/2026/wordml/cei" xmlns:w16cex="http://schemas.microsoft.com/office/word/2018/wordml/cex" xmlns:w16cid="http://schemas.microsoft.com/office/word/2016/wordml/cid" xmlns:w16="http://schemas.microsoft.com/office/word/2018/wordml" xmlns:w16sdtdh="http://schemas.microsoft.com/office/word/2020/wordml/sdtdatahash" xmlns:w16sdtfl="http://schemas.microsoft.com/office/word/2024/wordml/sdtformatlock" xmlns:w16se="http://schemas.microsoft.com/office/word/2015/wordml/symex" xmlns:w16du="http://schemas.microsoft.com/office/word/2023/wordml/word16du" xmlns:wne="http://schemas.microsoft.com/office/word/2006/wordml" mc:Ignorable="w14 w15 w16se w16cid w16 w16cex w16sdtdh w16sdtfl w16du wp14">
   <w:footnote w:type="separator" w:id="-1">
     <w:p>
       <w:r>
@@ -1055,7 +1001,7 @@
 </file>
 
 <file path=word/numbering.xml><?xml version="1.0" encoding="utf-8"?>
-<w:numbering xmlns:wpc="http://schemas.microsoft.com/office/word/2010/wordprocessingCanvas" xmlns:cx="http://schemas.microsoft.com/office/drawing/2014/chartex" xmlns:cx1="http://schemas.microsoft.com/office/drawing/2015/9/8/chartex" xmlns:cx2="http://schemas.microsoft.com/office/drawing/2015/10/21/chartex" xmlns:cx3="http://schemas.microsoft.com/office/drawing/2016/5/9/chartex" xmlns:cx4="http://schemas.microsoft.com/office/drawing/2016/5/10/chartex" xmlns:cx5="http://schemas.microsoft.com/office/drawing/2016/5/11/chartex" xmlns:cx6="http://schemas.microsoft.com/office/drawing/2016/5/12/chartex" xmlns:cx7="http://schemas.microsoft.com/office/drawing/2016/5/13/chartex" xmlns:cx8="http://schemas.microsoft.com/office/drawing/2016/5/14/chartex" xmlns:mc="http://schemas.openxmlformats.org/markup-compatibility/2006" xmlns:aink="http://schemas.microsoft.com/office/drawing/2016/ink" xmlns:am3d="http://schemas.microsoft.com/office/drawing/2017/model3d" xmlns:o="urn:schemas-microsoft-com:office:office" xmlns:oel="http://schemas.microsoft.com/office/2019/extlst" xmlns:r="http://schemas.openxmlformats.org/officeDocument/2006/relationships" xmlns:m="http://schemas.openxmlformats.org/officeDocument/2006/math" xmlns:v="urn:schemas-microsoft-com:vml" xmlns:wp14="http://schemas.microsoft.com/office/word/2010/wordprocessingDrawing" xmlns:wp="http://schemas.openxmlformats.org/drawingml/2006/wordprocessingDrawing" xmlns:w10="urn:schemas-microsoft-com:office:word" xmlns:w="http://schemas.openxmlformats.org/wordprocessingml/2006/main" xmlns:w14="http://schemas.microsoft.com/office/word/2010/wordml" xmlns:w15="http://schemas.microsoft.com/office/word/2012/wordml" xmlns:w16cex="http://schemas.microsoft.com/office/word/2018/wordml/cex" xmlns:w16cid="http://schemas.microsoft.com/office/word/2016/wordml/cid" xmlns:w16="http://schemas.microsoft.com/office/word/2018/wordml" xmlns:w16du="http://schemas.microsoft.com/office/word/2023/wordml/word16du" xmlns:w16sdtdh="http://schemas.microsoft.com/office/word/2020/wordml/sdtdatahash" xmlns:w16sdtfl="http://schemas.microsoft.com/office/word/2024/wordml/sdtformatlock" xmlns:w16se="http://schemas.microsoft.com/office/word/2015/wordml/symex" xmlns:wpg="http://schemas.microsoft.com/office/word/2010/wordprocessingGroup" xmlns:wpi="http://schemas.microsoft.com/office/word/2010/wordprocessingInk" xmlns:wne="http://schemas.microsoft.com/office/word/2006/wordml" xmlns:wps="http://schemas.microsoft.com/office/word/2010/wordprocessingShape" mc:Ignorable="w14 w15 w16se w16cid w16 w16cex w16sdtdh w16sdtfl w16du wp14">
+<w:numbering xmlns:wpc="http://schemas.microsoft.com/office/word/2010/wordprocessingCanvas" xmlns:cx="http://schemas.microsoft.com/office/drawing/2014/chartex" xmlns:cx1="http://schemas.microsoft.com/office/drawing/2015/9/8/chartex" xmlns:cx2="http://schemas.microsoft.com/office/drawing/2015/10/21/chartex" xmlns:cx3="http://schemas.microsoft.com/office/drawing/2016/5/9/chartex" xmlns:cx4="http://schemas.microsoft.com/office/drawing/2016/5/10/chartex" xmlns:cx5="http://schemas.microsoft.com/office/drawing/2016/5/11/chartex" xmlns:cx6="http://schemas.microsoft.com/office/drawing/2016/5/12/chartex" xmlns:cx7="http://schemas.microsoft.com/office/drawing/2016/5/13/chartex" xmlns:cx8="http://schemas.microsoft.com/office/drawing/2016/5/14/chartex" xmlns:mc="http://schemas.openxmlformats.org/markup-compatibility/2006" xmlns:m="http://schemas.openxmlformats.org/officeDocument/2006/math" xmlns:aink="http://schemas.microsoft.com/office/drawing/2016/ink" xmlns:am3d="http://schemas.microsoft.com/office/drawing/2017/model3d" xmlns:oel="http://schemas.microsoft.com/office/2019/extlst" xmlns:r="http://schemas.openxmlformats.org/officeDocument/2006/relationships" xmlns:wp14="http://schemas.microsoft.com/office/word/2010/wordprocessingDrawing" xmlns:wp="http://schemas.openxmlformats.org/drawingml/2006/wordprocessingDrawing" xmlns:wpg="http://schemas.microsoft.com/office/word/2010/wordprocessingGroup" xmlns:wpi="http://schemas.microsoft.com/office/word/2010/wordprocessingInk" xmlns:wps="http://schemas.microsoft.com/office/word/2010/wordprocessingShape" xmlns:o="urn:schemas-microsoft-com:office:office" xmlns:v="urn:schemas-microsoft-com:vml" xmlns:w10="urn:schemas-microsoft-com:office:word" xmlns:w="http://schemas.openxmlformats.org/wordprocessingml/2006/main" xmlns:w14="http://schemas.microsoft.com/office/word/2010/wordml" xmlns:w15="http://schemas.microsoft.com/office/word/2012/wordml" xmlns:w16cei="http://schemas.microsoft.com/office/word/2026/wordml/cei" xmlns:w16cex="http://schemas.microsoft.com/office/word/2018/wordml/cex" xmlns:w16cid="http://schemas.microsoft.com/office/word/2016/wordml/cid" xmlns:w16="http://schemas.microsoft.com/office/word/2018/wordml" xmlns:w16sdtdh="http://schemas.microsoft.com/office/word/2020/wordml/sdtdatahash" xmlns:w16sdtfl="http://schemas.microsoft.com/office/word/2024/wordml/sdtformatlock" xmlns:w16se="http://schemas.microsoft.com/office/word/2015/wordml/symex" xmlns:w16du="http://schemas.microsoft.com/office/word/2023/wordml/word16du" xmlns:wne="http://schemas.microsoft.com/office/word/2006/wordml" mc:Ignorable="w14 w15 w16se w16cid w16 w16cex w16sdtdh w16sdtfl w16du wp14">
   <w:abstractNum w:abstractNumId="0" w15:restartNumberingAfterBreak="0">
     <w:nsid w:val="69C337CB"/>
     <w:multiLevelType w:val="multilevel"/>
@@ -1063,7 +1009,7 @@
     <w:lvl w:ilvl="0">
       <w:start w:val="1"/>
       <w:numFmt w:val="none"/>
-      <w:pStyle w:val="1"/>
+      <w:pStyle w:val="Heading1"/>
       <w:suff w:val="nothing"/>
       <w:lvlText w:val=""/>
       <w:lvlJc w:val="left"/>
@@ -1077,7 +1023,7 @@
     <w:lvl w:ilvl="1">
       <w:start w:val="1"/>
       <w:numFmt w:val="none"/>
-      <w:pStyle w:val="2"/>
+      <w:pStyle w:val="Heading2"/>
       <w:suff w:val="nothing"/>
       <w:lvlText w:val=""/>
       <w:lvlJc w:val="left"/>
@@ -1187,11 +1133,11 @@
 </file>
 
 <file path=word/styles.xml><?xml version="1.0" encoding="utf-8"?>
-<w:styles xmlns:mc="http://schemas.openxmlformats.org/markup-compatibility/2006" xmlns:r="http://schemas.openxmlformats.org/officeDocument/2006/relationships" xmlns:w="http://schemas.openxmlformats.org/wordprocessingml/2006/main" xmlns:w14="http://schemas.microsoft.com/office/word/2010/wordml" xmlns:w15="http://schemas.microsoft.com/office/word/2012/wordml" xmlns:w16cex="http://schemas.microsoft.com/office/word/2018/wordml/cex" xmlns:w16cid="http://schemas.microsoft.com/office/word/2016/wordml/cid" xmlns:w16="http://schemas.microsoft.com/office/word/2018/wordml" xmlns:w16du="http://schemas.microsoft.com/office/word/2023/wordml/word16du" xmlns:w16sdtdh="http://schemas.microsoft.com/office/word/2020/wordml/sdtdatahash" xmlns:w16sdtfl="http://schemas.microsoft.com/office/word/2024/wordml/sdtformatlock" xmlns:w16se="http://schemas.microsoft.com/office/word/2015/wordml/symex" mc:Ignorable="w14 w15 w16se w16cid w16 w16cex w16sdtdh w16sdtfl w16du">
+<w:styles xmlns:mc="http://schemas.openxmlformats.org/markup-compatibility/2006" xmlns:r="http://schemas.openxmlformats.org/officeDocument/2006/relationships" xmlns:w="http://schemas.openxmlformats.org/wordprocessingml/2006/main" xmlns:w14="http://schemas.microsoft.com/office/word/2010/wordml" xmlns:w15="http://schemas.microsoft.com/office/word/2012/wordml" xmlns:w16cex="http://schemas.microsoft.com/office/word/2018/wordml/cex" xmlns:w16cid="http://schemas.microsoft.com/office/word/2016/wordml/cid" xmlns:w16="http://schemas.microsoft.com/office/word/2018/wordml" xmlns:w16sdtdh="http://schemas.microsoft.com/office/word/2020/wordml/sdtdatahash" xmlns:w16sdtfl="http://schemas.microsoft.com/office/word/2024/wordml/sdtformatlock" xmlns:w16se="http://schemas.microsoft.com/office/word/2015/wordml/symex" xmlns:w16du="http://schemas.microsoft.com/office/word/2023/wordml/word16du" mc:Ignorable="w14 w15 w16se w16cid w16 w16cex w16sdtdh w16sdtfl w16du">
   <w:docDefaults>
     <w:rPrDefault>
       <w:rPr>
-        <w:rFonts w:ascii="Liberation Serif" w:eastAsia="宋体" w:hAnsi="Liberation Serif" w:cs="Noto Sans Devanagari"/>
+        <w:rFonts w:ascii="Liberation Serif" w:eastAsia="SimSun" w:hAnsi="Liberation Serif" w:cs="Noto Sans Devanagari"/>
         <w:szCs w:val="24"/>
         <w:lang w:val="en-US" w:eastAsia="zh-CN" w:bidi="hi-IN"/>
       </w:rPr>
@@ -1580,7 +1526,7 @@
     <w:lsdException w:name="Unresolved Mention" w:semiHidden="1" w:unhideWhenUsed="1"/>
     <w:lsdException w:name="Smart Link" w:semiHidden="1" w:unhideWhenUsed="1"/>
   </w:latentStyles>
-  <w:style w:type="paragraph" w:default="1" w:styleId="a">
+  <w:style w:type="paragraph" w:default="1" w:styleId="Normal">
     <w:name w:val="Normal"/>
     <w:qFormat/>
     <w:rPr>
@@ -1589,10 +1535,10 @@
       <w:lang w:bidi="ar-SA"/>
     </w:rPr>
   </w:style>
-  <w:style w:type="paragraph" w:styleId="1">
+  <w:style w:type="paragraph" w:styleId="Heading1">
     <w:name w:val="heading 1"/>
-    <w:basedOn w:val="a"/>
-    <w:next w:val="a"/>
+    <w:basedOn w:val="Normal"/>
+    <w:next w:val="Normal"/>
     <w:uiPriority w:val="9"/>
     <w:qFormat/>
     <w:pPr>
@@ -1608,10 +1554,10 @@
       <w:i/>
     </w:rPr>
   </w:style>
-  <w:style w:type="paragraph" w:styleId="2">
+  <w:style w:type="paragraph" w:styleId="Heading2">
     <w:name w:val="heading 2"/>
-    <w:basedOn w:val="a"/>
-    <w:next w:val="a"/>
+    <w:basedOn w:val="Normal"/>
+    <w:next w:val="Normal"/>
     <w:uiPriority w:val="9"/>
     <w:semiHidden/>
     <w:unhideWhenUsed/>
@@ -1629,12 +1575,13 @@
       <w:iCs/>
     </w:rPr>
   </w:style>
-  <w:style w:type="character" w:default="1" w:styleId="a0">
+  <w:style w:type="character" w:default="1" w:styleId="DefaultParagraphFont">
     <w:name w:val="Default Paragraph Font"/>
     <w:uiPriority w:val="1"/>
+    <w:semiHidden/>
     <w:unhideWhenUsed/>
   </w:style>
-  <w:style w:type="table" w:default="1" w:styleId="a1">
+  <w:style w:type="table" w:default="1" w:styleId="TableNormal">
     <w:name w:val="Normal Table"/>
     <w:uiPriority w:val="99"/>
     <w:semiHidden/>
@@ -1649,7 +1596,7 @@
       </w:tblCellMar>
     </w:tblPr>
   </w:style>
-  <w:style w:type="numbering" w:default="1" w:styleId="a2">
+  <w:style w:type="numbering" w:default="1" w:styleId="NoList">
     <w:name w:val="No List"/>
     <w:uiPriority w:val="99"/>
     <w:semiHidden/>
@@ -1707,8 +1654,8 @@
   </w:style>
   <w:style w:type="paragraph" w:customStyle="1" w:styleId="Heading">
     <w:name w:val="Heading"/>
-    <w:basedOn w:val="a"/>
-    <w:next w:val="a3"/>
+    <w:basedOn w:val="Normal"/>
+    <w:next w:val="BodyText"/>
     <w:qFormat/>
     <w:pPr>
       <w:keepNext/>
@@ -1720,23 +1667,23 @@
       <w:szCs w:val="28"/>
     </w:rPr>
   </w:style>
-  <w:style w:type="paragraph" w:styleId="a3">
+  <w:style w:type="paragraph" w:styleId="BodyText">
     <w:name w:val="Body Text"/>
-    <w:basedOn w:val="a"/>
+    <w:basedOn w:val="Normal"/>
     <w:pPr>
       <w:spacing w:after="140" w:line="276" w:lineRule="auto"/>
     </w:pPr>
   </w:style>
-  <w:style w:type="paragraph" w:styleId="a4">
+  <w:style w:type="paragraph" w:styleId="List">
     <w:name w:val="List"/>
-    <w:basedOn w:val="a3"/>
+    <w:basedOn w:val="BodyText"/>
     <w:rPr>
       <w:rFonts w:cs="Noto Sans Devanagari"/>
     </w:rPr>
   </w:style>
-  <w:style w:type="paragraph" w:styleId="a5">
+  <w:style w:type="paragraph" w:styleId="Caption">
     <w:name w:val="caption"/>
-    <w:basedOn w:val="a"/>
+    <w:basedOn w:val="Normal"/>
     <w:qFormat/>
     <w:pPr>
       <w:suppressLineNumbers/>
@@ -1750,7 +1697,7 @@
   </w:style>
   <w:style w:type="paragraph" w:customStyle="1" w:styleId="Index">
     <w:name w:val="Index"/>
-    <w:basedOn w:val="a"/>
+    <w:basedOn w:val="Normal"/>
     <w:qFormat/>
     <w:pPr>
       <w:suppressLineNumbers/>
@@ -1761,7 +1708,7 @@
   </w:style>
   <w:style w:type="paragraph" w:customStyle="1" w:styleId="HeaderandFooter">
     <w:name w:val="Header and Footer"/>
-    <w:basedOn w:val="a"/>
+    <w:basedOn w:val="Normal"/>
     <w:qFormat/>
     <w:pPr>
       <w:suppressLineNumbers/>
@@ -1771,9 +1718,9 @@
       </w:tabs>
     </w:pPr>
   </w:style>
-  <w:style w:type="paragraph" w:styleId="a6">
+  <w:style w:type="paragraph" w:styleId="Header">
     <w:name w:val="header"/>
-    <w:basedOn w:val="a"/>
+    <w:basedOn w:val="Normal"/>
     <w:pPr>
       <w:tabs>
         <w:tab w:val="center" w:pos="4320"/>
@@ -1781,9 +1728,9 @@
       </w:tabs>
     </w:pPr>
   </w:style>
-  <w:style w:type="paragraph" w:styleId="a7">
+  <w:style w:type="paragraph" w:styleId="Footer">
     <w:name w:val="footer"/>
-    <w:basedOn w:val="a"/>
+    <w:basedOn w:val="Normal"/>
     <w:pPr>
       <w:tabs>
         <w:tab w:val="center" w:pos="4320"/>
@@ -1793,7 +1740,7 @@
   </w:style>
   <w:style w:type="paragraph" w:customStyle="1" w:styleId="TableContents">
     <w:name w:val="Table Contents"/>
-    <w:basedOn w:val="a"/>
+    <w:basedOn w:val="Normal"/>
     <w:qFormat/>
     <w:pPr>
       <w:suppressLineNumbers/>

</xml_diff>